<commit_message>
edit ad spend hardcode
</commit_message>
<xml_diff>
--- a/Evolve_Dashboard_Metric_Computations.docx
+++ b/Evolve_Dashboard_Metric_Computations.docx
@@ -3340,6 +3340,354 @@
     </w:p>
     <w:p>
       <w:pPr>
+        <w:pStyle w:val="Heading2"/>
+      </w:pPr>
+      <w:r>
+        <w:rPr>
+          <w:color w:val="1F3955"/>
+        </w:rPr>
+        <w:t>MTD Ad Spend</w:t>
+      </w:r>
+    </w:p>
+    <w:p>
+      <w:pPr>
+        <w:spacing w:after="80"/>
+        <w:ind w:left="280"/>
+      </w:pPr>
+      <w:r>
+        <w:rPr>
+          <w:rFonts w:ascii="Consolas" w:hAnsi="Consolas"/>
+          <w:color w:val="1F3955"/>
+          <w:sz w:val="19"/>
+        </w:rPr>
+        <w:t>SUM(daily ad spend) for dates in [month start, latest]    -- Google + Facebook</w:t>
+      </w:r>
+    </w:p>
+    <w:tbl>
+      <w:tblPr>
+        <w:tblStyle w:val="TableGrid"/>
+        <w:tblW w:type="auto" w:w="0"/>
+        <w:tblLook w:firstColumn="1" w:firstRow="1" w:lastColumn="0" w:lastRow="0" w:noHBand="0" w:noVBand="1" w:val="04A0"/>
+      </w:tblPr>
+      <w:tblGrid>
+        <w:gridCol w:w="4320"/>
+        <w:gridCol w:w="4320"/>
+      </w:tblGrid>
+      <w:tr>
+        <w:tc>
+          <w:tcPr>
+            <w:tcW w:type="dxa" w:w="4320"/>
+          </w:tcPr>
+          <w:p>
+            <w:r>
+              <w:rPr>
+                <w:b/>
+                <w:sz w:val="19"/>
+              </w:rPr>
+              <w:t>Numerator (sum of daily spend)</w:t>
+            </w:r>
+          </w:p>
+        </w:tc>
+        <w:tc>
+          <w:tcPr>
+            <w:tcW w:type="dxa" w:w="4320"/>
+          </w:tcPr>
+          <w:p>
+            <w:r>
+              <w:rPr>
+                <w:b w:val="0"/>
+                <w:sz w:val="19"/>
+              </w:rPr>
+              <w:t>33,450.53</w:t>
+            </w:r>
+          </w:p>
+        </w:tc>
+      </w:tr>
+      <w:tr>
+        <w:tc>
+          <w:tcPr>
+            <w:tcW w:type="dxa" w:w="4320"/>
+          </w:tcPr>
+          <w:p>
+            <w:r>
+              <w:rPr>
+                <w:b/>
+                <w:sz w:val="19"/>
+              </w:rPr>
+              <w:t>Denominator</w:t>
+            </w:r>
+          </w:p>
+        </w:tc>
+        <w:tc>
+          <w:tcPr>
+            <w:tcW w:type="dxa" w:w="4320"/>
+          </w:tcPr>
+          <w:p>
+            <w:r>
+              <w:rPr>
+                <w:b w:val="0"/>
+                <w:sz w:val="19"/>
+              </w:rPr>
+              <w:t>—</w:t>
+            </w:r>
+          </w:p>
+        </w:tc>
+      </w:tr>
+      <w:tr>
+        <w:tc>
+          <w:tcPr>
+            <w:tcW w:type="dxa" w:w="4320"/>
+          </w:tcPr>
+          <w:p>
+            <w:r>
+              <w:rPr>
+                <w:b/>
+                <w:sz w:val="19"/>
+              </w:rPr>
+              <w:t>Computed value</w:t>
+            </w:r>
+          </w:p>
+        </w:tc>
+        <w:tc>
+          <w:tcPr>
+            <w:tcW w:type="dxa" w:w="4320"/>
+          </w:tcPr>
+          <w:p>
+            <w:r>
+              <w:rPr>
+                <w:b w:val="0"/>
+                <w:sz w:val="19"/>
+              </w:rPr>
+              <w:t>$33,450.53 (~$33K)</w:t>
+            </w:r>
+          </w:p>
+        </w:tc>
+      </w:tr>
+      <w:tr>
+        <w:tc>
+          <w:tcPr>
+            <w:tcW w:type="dxa" w:w="4320"/>
+          </w:tcPr>
+          <w:p>
+            <w:r>
+              <w:rPr>
+                <w:b/>
+                <w:sz w:val="19"/>
+              </w:rPr>
+              <w:t>Dashboard (after deploy)</w:t>
+            </w:r>
+          </w:p>
+        </w:tc>
+        <w:tc>
+          <w:tcPr>
+            <w:tcW w:type="dxa" w:w="4320"/>
+          </w:tcPr>
+          <w:p>
+            <w:r>
+              <w:rPr>
+                <w:b w:val="0"/>
+                <w:sz w:val="19"/>
+              </w:rPr>
+              <w:t>~$33K</w:t>
+            </w:r>
+          </w:p>
+        </w:tc>
+      </w:tr>
+    </w:tbl>
+    <w:p>
+      <w:pPr>
+        <w:spacing w:after="40"/>
+      </w:pPr>
+    </w:p>
+    <w:p>
+      <w:pPr>
+        <w:spacing w:after="200"/>
+      </w:pPr>
+      <w:r>
+        <w:rPr>
+          <w:b/>
+          <w:color w:val="1E7A3C"/>
+          <w:sz w:val="19"/>
+        </w:rPr>
+        <w:t>MATCHES — NOT FROM THE DATABASE. Source is a bundled static file: data/Google Ads.xlsx -&gt; data/ad_spend_daily.json (regenerate via scripts/build_ad_spend_json.py when the export is refreshed). The MTD figure is summed dynamically for the date window, but the spend data is static. Chain-level only (campaigns aren't location-tagged); FB sheet empty.</w:t>
+      </w:r>
+    </w:p>
+    <w:p>
+      <w:pPr>
+        <w:pStyle w:val="Heading2"/>
+      </w:pPr>
+      <w:r>
+        <w:rPr>
+          <w:color w:val="1F3955"/>
+        </w:rPr>
+        <w:t>Client Acquisition Cost</w:t>
+      </w:r>
+    </w:p>
+    <w:p>
+      <w:pPr>
+        <w:spacing w:after="80"/>
+        <w:ind w:left="280"/>
+      </w:pPr>
+      <w:r>
+        <w:rPr>
+          <w:rFonts w:ascii="Consolas" w:hAnsi="Consolas"/>
+          <w:color w:val="1F3955"/>
+          <w:sz w:val="19"/>
+        </w:rPr>
+        <w:t>MTD Ad Spend / New Customers</w:t>
+      </w:r>
+    </w:p>
+    <w:tbl>
+      <w:tblPr>
+        <w:tblStyle w:val="TableGrid"/>
+        <w:tblW w:type="auto" w:w="0"/>
+        <w:tblLook w:firstColumn="1" w:firstRow="1" w:lastColumn="0" w:lastRow="0" w:noHBand="0" w:noVBand="1" w:val="04A0"/>
+      </w:tblPr>
+      <w:tblGrid>
+        <w:gridCol w:w="4320"/>
+        <w:gridCol w:w="4320"/>
+      </w:tblGrid>
+      <w:tr>
+        <w:tc>
+          <w:tcPr>
+            <w:tcW w:type="dxa" w:w="4320"/>
+          </w:tcPr>
+          <w:p>
+            <w:r>
+              <w:rPr>
+                <w:b/>
+                <w:sz w:val="19"/>
+              </w:rPr>
+              <w:t>Numerator (MTD ad spend)</w:t>
+            </w:r>
+          </w:p>
+        </w:tc>
+        <w:tc>
+          <w:tcPr>
+            <w:tcW w:type="dxa" w:w="4320"/>
+          </w:tcPr>
+          <w:p>
+            <w:r>
+              <w:rPr>
+                <w:b w:val="0"/>
+                <w:sz w:val="19"/>
+              </w:rPr>
+              <w:t>33,450.53</w:t>
+            </w:r>
+          </w:p>
+        </w:tc>
+      </w:tr>
+      <w:tr>
+        <w:tc>
+          <w:tcPr>
+            <w:tcW w:type="dxa" w:w="4320"/>
+          </w:tcPr>
+          <w:p>
+            <w:r>
+              <w:rPr>
+                <w:b/>
+                <w:sz w:val="19"/>
+              </w:rPr>
+              <w:t>Denominator (new customers)</w:t>
+            </w:r>
+          </w:p>
+        </w:tc>
+        <w:tc>
+          <w:tcPr>
+            <w:tcW w:type="dxa" w:w="4320"/>
+          </w:tcPr>
+          <w:p>
+            <w:r>
+              <w:rPr>
+                <w:b w:val="0"/>
+                <w:sz w:val="19"/>
+              </w:rPr>
+              <w:t>605</w:t>
+            </w:r>
+          </w:p>
+        </w:tc>
+      </w:tr>
+      <w:tr>
+        <w:tc>
+          <w:tcPr>
+            <w:tcW w:type="dxa" w:w="4320"/>
+          </w:tcPr>
+          <w:p>
+            <w:r>
+              <w:rPr>
+                <w:b/>
+                <w:sz w:val="19"/>
+              </w:rPr>
+              <w:t>Computed value</w:t>
+            </w:r>
+          </w:p>
+        </w:tc>
+        <w:tc>
+          <w:tcPr>
+            <w:tcW w:type="dxa" w:w="4320"/>
+          </w:tcPr>
+          <w:p>
+            <w:r>
+              <w:rPr>
+                <w:b w:val="0"/>
+                <w:sz w:val="19"/>
+              </w:rPr>
+              <w:t>$55.29</w:t>
+            </w:r>
+          </w:p>
+        </w:tc>
+      </w:tr>
+      <w:tr>
+        <w:tc>
+          <w:tcPr>
+            <w:tcW w:type="dxa" w:w="4320"/>
+          </w:tcPr>
+          <w:p>
+            <w:r>
+              <w:rPr>
+                <w:b/>
+                <w:sz w:val="19"/>
+              </w:rPr>
+              <w:t>Dashboard (after deploy)</w:t>
+            </w:r>
+          </w:p>
+        </w:tc>
+        <w:tc>
+          <w:tcPr>
+            <w:tcW w:type="dxa" w:w="4320"/>
+          </w:tcPr>
+          <w:p>
+            <w:r>
+              <w:rPr>
+                <w:b w:val="0"/>
+                <w:sz w:val="19"/>
+              </w:rPr>
+              <w:t>$55</w:t>
+            </w:r>
+          </w:p>
+        </w:tc>
+      </w:tr>
+    </w:tbl>
+    <w:p>
+      <w:pPr>
+        <w:spacing w:after="40"/>
+      </w:pPr>
+    </w:p>
+    <w:p>
+      <w:pPr>
+        <w:spacing w:after="200"/>
+      </w:pPr>
+      <w:r>
+        <w:rPr>
+          <w:b/>
+          <w:color w:val="1E7A3C"/>
+          <w:sz w:val="19"/>
+        </w:rPr>
+        <w:t>MATCHES — Numerator from the bundled ad-spend file; denominator (new customers) from the DB. Correct on the All-Locations view; if a single location is selected, ad spend stays chain-wide while new customers is location-scoped, so CAC is mismatched there.</w:t>
+      </w:r>
+    </w:p>
+    <w:p>
+      <w:pPr>
         <w:pStyle w:val="Heading1"/>
       </w:pPr>
       <w:r>
@@ -3380,6 +3728,17 @@
           <w:sz w:val="20"/>
         </w:rPr>
         <w:t>SSS Growth YoY % — FIXED in routers/mtd.py: py_end anchors to the latest current-data day, not month-end, so partial current is compared to an equal prior-year window. Goes from -8.7% to +1.6%.</w:t>
+      </w:r>
+    </w:p>
+    <w:p>
+      <w:pPr>
+        <w:pStyle w:val="ListBullet"/>
+      </w:pPr>
+      <w:r>
+        <w:rPr>
+          <w:sz w:val="20"/>
+        </w:rPr>
+        <w:t>MTD Ad Spend / CAC — NEW: sourced from a bundled static file (data/Google Ads.xlsx -&gt; ad_spend_daily.json), NOT the database. Chain-level; ~$33K MTD, CAC ~$55.</w:t>
       </w:r>
     </w:p>
     <w:p>

</xml_diff>

<commit_message>
edit dashboard product mix
</commit_message>
<xml_diff>
--- a/Evolve_Dashboard_Metric_Computations.docx
+++ b/Evolve_Dashboard_Metric_Computations.docx
@@ -3708,7 +3708,7 @@
           <w:color w:val="1F3955"/>
           <w:sz w:val="19"/>
         </w:rPr>
-        <w:t>-- per product, item_type = 'Product', ranked by units desc</w:t>
+        <w:t>-- per product, ranked by units desc, from the cost-of-goods consumption table</w:t>
       </w:r>
       <w:r>
         <w:rPr>
@@ -3717,7 +3717,7 @@
           <w:sz w:val="19"/>
         </w:rPr>
         <w:br/>
-        <w:t>units = SUM( CASE WHEN UPPER(item_name) LIKE '%DYSPORT%'</w:t>
+        <w:t>units = SUM( CASE WHEN UPPER(product_name) LIKE '%DYSPORT%'</w:t>
       </w:r>
       <w:r>
         <w:rPr>
@@ -3744,7 +3744,7 @@
           <w:sz w:val="19"/>
         </w:rPr>
         <w:br/>
-        <w:t>GROUP BY item_name   -- product NAME, not item_category</w:t>
+        <w:t>GROUP BY product_name</w:t>
       </w:r>
     </w:p>
     <w:tbl>
@@ -3782,7 +3782,7 @@
                 <w:b w:val="0"/>
                 <w:sz w:val="19"/>
               </w:rPr>
-              <w:t>one row per product name (item_name)</w:t>
+              <w:t>one row per product_name</w:t>
             </w:r>
           </w:p>
         </w:tc>
@@ -3812,7 +3812,7 @@
                 <w:b w:val="0"/>
                 <w:sz w:val="19"/>
               </w:rPr>
-              <w:t>item_type = 'Product'</w:t>
+              <w:t>product_name IS NOT NULL (consumption rows)</w:t>
             </w:r>
           </w:p>
         </w:tc>
@@ -3872,7 +3872,7 @@
                 <w:b w:val="0"/>
                 <w:sz w:val="19"/>
               </w:rPr>
-              <w:t>BRONZE_ZENOTI_SALES_ACCRUAL (DB)</w:t>
+              <w:t>BRONZE_ZENOTI_COST_OF_GOODS (DB)</w:t>
             </w:r>
           </w:p>
         </w:tc>
@@ -3893,7 +3893,7 @@
           <w:color w:val="1E7A3C"/>
           <w:sz w:val="19"/>
         </w:rPr>
-        <w:t>MATCHES — Endpoint /api/product-mix; dashboard shows top products by units. Was previously grouped by item_category (collapsed all products into one 'Retail' row) — now by product name. Dysport qty is divided by 3 to make units comparable to other injectables.</w:t>
+        <w:t>MATCHES — Endpoint /api/product-mix; dashboard shows top products by units. Uses product_name + qty from the cost-of-goods consumption table (sales table only has item_name). Was previously one collapsed 'Retail' row. Dysport qty divided by 3 to compare to other injectables.</w:t>
       </w:r>
     </w:p>
     <w:p>
@@ -3959,7 +3959,7 @@
         <w:rPr>
           <w:sz w:val="20"/>
         </w:rPr>
-        <w:t>Product Mix — NEW: now by product NAME (item_name) and unit consumption, with Dysport qty / 3. Was previously a single 'Retail' category row.</w:t>
+        <w:t>Product Mix — NEW: by product_name + unit consumption from BRONZE_ZENOTI_COST_OF_GOODS, with Dysport qty / 3. Was previously a single 'Retail' category row.</w:t>
       </w:r>
     </w:p>
     <w:p>

</xml_diff>

<commit_message>
edit values and dashboard
</commit_message>
<xml_diff>
--- a/Evolve_Dashboard_Metric_Computations.docx
+++ b/Evolve_Dashboard_Metric_Computations.docx
@@ -219,7 +219,25 @@
           <w:color w:val="1F3955"/>
           <w:sz w:val="19"/>
         </w:rPr>
-        <w:t>SUM(sales_collected_exc_tax) / distinct_payment_days * days_in_month</w:t>
+        <w:t>per location:  (MTD cash / working days elapsed) x total working days in month</w:t>
+      </w:r>
+      <w:r>
+        <w:rPr>
+          <w:rFonts w:ascii="Consolas" w:hAnsi="Consolas"/>
+          <w:color w:val="1F3955"/>
+          <w:sz w:val="19"/>
+        </w:rPr>
+        <w:br/>
+        <w:t>chain = SUM of per-location run rates</w:t>
+      </w:r>
+      <w:r>
+        <w:rPr>
+          <w:rFonts w:ascii="Consolas" w:hAnsi="Consolas"/>
+          <w:color w:val="1F3955"/>
+          <w:sz w:val="19"/>
+        </w:rPr>
+        <w:br/>
+        <w:t>working days = Operating Schedule open days; elapsed = through latest data date</w:t>
       </w:r>
     </w:p>
     <w:tbl>
@@ -243,7 +261,7 @@
                 <w:b/>
                 <w:sz w:val="19"/>
               </w:rPr>
-              <w:t>Numerator (cash sales)</w:t>
+              <w:t>Per-location</w:t>
             </w:r>
           </w:p>
         </w:tc>
@@ -257,7 +275,7 @@
                 <w:b w:val="0"/>
                 <w:sz w:val="19"/>
               </w:rPr>
-              <w:t>1,297,752.54</w:t>
+              <w:t>MTD cash ÷ elapsed working days × total working days</w:t>
             </w:r>
           </w:p>
         </w:tc>
@@ -273,7 +291,7 @@
                 <w:b/>
                 <w:sz w:val="19"/>
               </w:rPr>
-              <w:t>Denominator (payment days)</w:t>
+              <w:t>Working days source</w:t>
             </w:r>
           </w:p>
         </w:tc>
@@ -287,7 +305,7 @@
                 <w:b w:val="0"/>
                 <w:sz w:val="19"/>
               </w:rPr>
-              <w:t>24</w:t>
+              <w:t>data/operating_days.json (Operating Schedule)</w:t>
             </w:r>
           </w:p>
         </w:tc>
@@ -303,7 +321,7 @@
                 <w:b/>
                 <w:sz w:val="19"/>
               </w:rPr>
-              <w:t>Computed value</w:t>
+              <w:t>Elapsed cutoff</w:t>
             </w:r>
           </w:p>
         </w:tc>
@@ -317,7 +335,7 @@
                 <w:b w:val="0"/>
                 <w:sz w:val="19"/>
               </w:rPr>
-              <w:t>$1,621,565.67</w:t>
+              <w:t>latest data date</w:t>
             </w:r>
           </w:p>
         </w:tc>
@@ -333,7 +351,7 @@
                 <w:b/>
                 <w:sz w:val="19"/>
               </w:rPr>
-              <w:t>Dashboard shows</w:t>
+              <w:t>Scope</w:t>
             </w:r>
           </w:p>
         </w:tc>
@@ -347,7 +365,7 @@
                 <w:b w:val="0"/>
                 <w:sz w:val="19"/>
               </w:rPr>
-              <w:t>$1.30M</w:t>
+              <w:t>Cash Sales hero only</w:t>
             </w:r>
           </w:p>
         </w:tc>
@@ -365,10 +383,10 @@
       <w:r>
         <w:rPr>
           <w:b/>
-          <w:color w:val="B02A2A"/>
+          <w:color w:val="1E7A3C"/>
           <w:sz w:val="19"/>
         </w:rPr>
-        <w:t>NEEDS REVIEW — Verification projects on payment-days; dashboard uses the daily-trend run rate. Different projection basis — review if the run-rate tile should match.</w:t>
+        <w:t>MATCHES — CHANGED. Was avg-of-data-days × calendar days. Now working-days based per location (open days from the Operating Schedule), elapsed counted through the latest data day, summed to a chain run rate. Header field cash_run_rate; applies to the Cash Sales hero only.</w:t>
       </w:r>
     </w:p>
     <w:p>
@@ -2128,6 +2146,263 @@
         <w:rPr>
           <w:color w:val="1F3955"/>
         </w:rPr>
+        <w:t>Payroll Margin %  (salary model)</w:t>
+      </w:r>
+    </w:p>
+    <w:p>
+      <w:pPr>
+        <w:spacing w:after="80"/>
+        <w:ind w:left="280"/>
+      </w:pPr>
+      <w:r>
+        <w:rPr>
+          <w:rFonts w:ascii="Consolas" w:hAnsi="Consolas"/>
+          <w:color w:val="1F3955"/>
+          <w:sz w:val="19"/>
+        </w:rPr>
+        <w:t>base salary      = SUM( role hourly wage x scheduled_hours )     -- wages JSON x schedule DB</w:t>
+      </w:r>
+      <w:r>
+        <w:rPr>
+          <w:rFonts w:ascii="Consolas" w:hAnsi="Consolas"/>
+          <w:color w:val="1F3955"/>
+          <w:sz w:val="19"/>
+        </w:rPr>
+        <w:br/>
+        <w:t>ffs              = SUM( Latest FFS x qty )   -- 'Y' -&gt; COGS qty; '0' -&gt; Latest FFS once per service (qty ignored)</w:t>
+      </w:r>
+      <w:r>
+        <w:rPr>
+          <w:rFonts w:ascii="Consolas" w:hAnsi="Consolas"/>
+          <w:color w:val="1F3955"/>
+          <w:sz w:val="19"/>
+        </w:rPr>
+        <w:br/>
+        <w:t>comm             = 0.15 x SUM(sales_exc_tax)</w:t>
+      </w:r>
+      <w:r>
+        <w:rPr>
+          <w:rFonts w:ascii="Consolas" w:hAnsi="Consolas"/>
+          <w:color w:val="1F3955"/>
+          <w:sz w:val="19"/>
+        </w:rPr>
+        <w:br/>
+        <w:t>benefits &amp; taxes = (base + ffs + comm) x 0.125</w:t>
+      </w:r>
+      <w:r>
+        <w:rPr>
+          <w:rFonts w:ascii="Consolas" w:hAnsi="Consolas"/>
+          <w:color w:val="1F3955"/>
+          <w:sz w:val="19"/>
+        </w:rPr>
+        <w:br/>
+        <w:t>salary           = base + ffs + comm + benefits</w:t>
+      </w:r>
+      <w:r>
+        <w:rPr>
+          <w:rFonts w:ascii="Consolas" w:hAnsi="Consolas"/>
+          <w:color w:val="1F3955"/>
+          <w:sz w:val="19"/>
+        </w:rPr>
+        <w:br/>
+        <w:t>Payroll Margin % = salary / SUM(sales_exc_tax) * 100</w:t>
+      </w:r>
+    </w:p>
+    <w:tbl>
+      <w:tblPr>
+        <w:tblStyle w:val="TableGrid"/>
+        <w:tblW w:type="auto" w:w="0"/>
+        <w:tblLook w:firstColumn="1" w:firstRow="1" w:lastColumn="0" w:lastRow="0" w:noHBand="0" w:noVBand="1" w:val="04A0"/>
+      </w:tblPr>
+      <w:tblGrid>
+        <w:gridCol w:w="4320"/>
+        <w:gridCol w:w="4320"/>
+      </w:tblGrid>
+      <w:tr>
+        <w:tc>
+          <w:tcPr>
+            <w:tcW w:type="dxa" w:w="4320"/>
+          </w:tcPr>
+          <w:p>
+            <w:r>
+              <w:rPr>
+                <w:b/>
+                <w:sz w:val="19"/>
+              </w:rPr>
+              <w:t>Wages / FFS rates / factors</w:t>
+            </w:r>
+          </w:p>
+        </w:tc>
+        <w:tc>
+          <w:tcPr>
+            <w:tcW w:type="dxa" w:w="4320"/>
+          </w:tcPr>
+          <w:p>
+            <w:r>
+              <w:rPr>
+                <w:b w:val="0"/>
+                <w:sz w:val="19"/>
+              </w:rPr>
+              <w:t>bundled: data/payroll_schedules.json (from Excel)</w:t>
+            </w:r>
+          </w:p>
+        </w:tc>
+      </w:tr>
+      <w:tr>
+        <w:tc>
+          <w:tcPr>
+            <w:tcW w:type="dxa" w:w="4320"/>
+          </w:tcPr>
+          <w:p>
+            <w:r>
+              <w:rPr>
+                <w:b/>
+                <w:sz w:val="19"/>
+              </w:rPr>
+              <w:t>Hours</w:t>
+            </w:r>
+          </w:p>
+        </w:tc>
+        <w:tc>
+          <w:tcPr>
+            <w:tcW w:type="dxa" w:w="4320"/>
+          </w:tcPr>
+          <w:p>
+            <w:r>
+              <w:rPr>
+                <w:b w:val="0"/>
+                <w:sz w:val="19"/>
+              </w:rPr>
+              <w:t>scheduled_hours (BRONZE_ZENOTI_EMPLOYEE_SCHEDULES)</w:t>
+            </w:r>
+          </w:p>
+        </w:tc>
+      </w:tr>
+      <w:tr>
+        <w:tc>
+          <w:tcPr>
+            <w:tcW w:type="dxa" w:w="4320"/>
+          </w:tcPr>
+          <w:p>
+            <w:r>
+              <w:rPr>
+                <w:b/>
+                <w:sz w:val="19"/>
+              </w:rPr>
+              <w:t>FFS match</w:t>
+            </w:r>
+          </w:p>
+        </w:tc>
+        <w:tc>
+          <w:tcPr>
+            <w:tcW w:type="dxa" w:w="4320"/>
+          </w:tcPr>
+          <w:p>
+            <w:r>
+              <w:rPr>
+                <w:b w:val="0"/>
+                <w:sz w:val="19"/>
+              </w:rPr>
+              <w:t>service_name (BRONZE_ZENOTI_COST_OF_GOODS)</w:t>
+            </w:r>
+          </w:p>
+        </w:tc>
+      </w:tr>
+      <w:tr>
+        <w:tc>
+          <w:tcPr>
+            <w:tcW w:type="dxa" w:w="4320"/>
+          </w:tcPr>
+          <w:p>
+            <w:r>
+              <w:rPr>
+                <w:b/>
+                <w:sz w:val="19"/>
+              </w:rPr>
+              <w:t>Denominator</w:t>
+            </w:r>
+          </w:p>
+        </w:tc>
+        <w:tc>
+          <w:tcPr>
+            <w:tcW w:type="dxa" w:w="4320"/>
+          </w:tcPr>
+          <w:p>
+            <w:r>
+              <w:rPr>
+                <w:b w:val="0"/>
+                <w:sz w:val="19"/>
+              </w:rPr>
+              <w:t>sales accrual = SUM(sales_exc_tax), NOT cash</w:t>
+            </w:r>
+          </w:p>
+        </w:tc>
+      </w:tr>
+    </w:tbl>
+    <w:p>
+      <w:pPr>
+        <w:spacing w:after="40"/>
+      </w:pPr>
+    </w:p>
+    <w:p>
+      <w:pPr>
+        <w:spacing w:after="200"/>
+      </w:pPr>
+      <w:r>
+        <w:rPr>
+          <w:b/>
+          <w:color w:val="1E7A3C"/>
+          <w:sz w:val="19"/>
+        </w:rPr>
+        <w:t>MATCHES — Replaces the old modeled 24.64%. Real salary built from the supporting schedules (hourly wage x scheduled hours) + FFS (per-syringe uses COGS qty, else 1/row) + 15% commission + 12.5% benefits. Computed per location and chain. Unmatched job_name/service_name contribute $0 — verify name coverage. Was shown as '—' on the dashboard.</w:t>
+      </w:r>
+    </w:p>
+    <w:p>
+      <w:pPr>
+        <w:pStyle w:val="Heading2"/>
+      </w:pPr>
+      <w:r>
+        <w:rPr>
+          <w:color w:val="1F3955"/>
+        </w:rPr>
+        <w:t>Gross Margin %</w:t>
+      </w:r>
+    </w:p>
+    <w:p>
+      <w:pPr>
+        <w:spacing w:after="80"/>
+        <w:ind w:left="280"/>
+      </w:pPr>
+      <w:r>
+        <w:rPr>
+          <w:rFonts w:ascii="Consolas" w:hAnsi="Consolas"/>
+          <w:color w:val="1F3955"/>
+          <w:sz w:val="19"/>
+        </w:rPr>
+        <w:t>Gross Margin % = 100 - COGS Margin % (real) - Payroll Margin % (real salary)</w:t>
+      </w:r>
+    </w:p>
+    <w:p>
+      <w:pPr>
+        <w:spacing w:after="200"/>
+      </w:pPr>
+      <w:r>
+        <w:rPr>
+          <w:b/>
+          <w:color w:val="1E7A3C"/>
+          <w:sz w:val="19"/>
+        </w:rPr>
+        <w:t>MATCHES — Both inputs are now real (COGS from cost-of-goods, payroll from the salary model). No longer uses the modeled 24.64% payroll assumption.</w:t>
+      </w:r>
+    </w:p>
+    <w:p>
+      <w:pPr>
+        <w:pStyle w:val="Heading2"/>
+      </w:pPr>
+      <w:r>
+        <w:rPr>
+          <w:color w:val="1F3955"/>
+        </w:rPr>
         <w:t>No-Show Rate %</w:t>
       </w:r>
     </w:p>
@@ -2664,7 +2939,7 @@
           <w:color w:val="1F3955"/>
           <w:sz w:val="19"/>
         </w:rPr>
-        <w:t>SUM(booked_hours) / SUM(scheduled_hours + block_out_hours_paid) * 100   (job = Treatment Provider)</w:t>
+        <w:t>SUM(booked_hours) / SUM(scheduled_hours - block_out_hours_paid) * 100   (job = Treatment Provider)</w:t>
       </w:r>
     </w:p>
     <w:tbl>
@@ -2838,7 +3113,7 @@
           <w:color w:val="1F3955"/>
           <w:sz w:val="19"/>
         </w:rPr>
-        <w:t>SUM(booked_hours) / SUM(scheduled_hours + block_out_hours_paid) * 100   (job = Esthetician)</w:t>
+        <w:t>SUM(booked_hours) / SUM(scheduled_hours - block_out_hours_paid) * 100   (job = Esthetician)</w:t>
       </w:r>
     </w:p>
     <w:tbl>
@@ -3970,6 +4245,17 @@
         <w:rPr>
           <w:sz w:val="20"/>
         </w:rPr>
+        <w:t>Payroll / Gross Margin — NEW: real salary model (utils/payroll.py) from the bundled supporting schedules (wage x scheduled hours + FFS + 15% comm + 12.5% benefits) replaces the modeled 24.64%. Gross margin now = 100 - real COGS% - real payroll%.</w:t>
+      </w:r>
+    </w:p>
+    <w:p>
+      <w:pPr>
+        <w:pStyle w:val="ListBullet"/>
+      </w:pPr>
+      <w:r>
+        <w:rPr>
+          <w:sz w:val="20"/>
+        </w:rPr>
         <w:t>Recognized Revenue, Utilization, Run Rate — small differences from date-window boundaries, not logic errors.</w:t>
       </w:r>
     </w:p>

</xml_diff>

<commit_message>
edited mtd ad, cac, error 500
</commit_message>
<xml_diff>
--- a/Evolve_Dashboard_Metric_Computations.docx
+++ b/Evolve_Dashboard_Metric_Computations.docx
@@ -3689,7 +3689,7 @@
                 <w:b/>
                 <w:sz w:val="19"/>
               </w:rPr>
-              <w:t>Numerator (sum of daily spend)</w:t>
+              <w:t>Google (Jun 2026 MTD)</w:t>
             </w:r>
           </w:p>
         </w:tc>
@@ -3703,7 +3703,7 @@
                 <w:b w:val="0"/>
                 <w:sz w:val="19"/>
               </w:rPr>
-              <w:t>33,450.53</w:t>
+              <w:t>$33,450.51</w:t>
             </w:r>
           </w:p>
         </w:tc>
@@ -3719,7 +3719,7 @@
                 <w:b/>
                 <w:sz w:val="19"/>
               </w:rPr>
-              <w:t>Denominator</w:t>
+              <w:t>Facebook (Jun 2026 MTD)</w:t>
             </w:r>
           </w:p>
         </w:tc>
@@ -3733,7 +3733,7 @@
                 <w:b w:val="0"/>
                 <w:sz w:val="19"/>
               </w:rPr>
-              <w:t>—</w:t>
+              <w:t>$77,780.82</w:t>
             </w:r>
           </w:p>
         </w:tc>
@@ -3763,7 +3763,7 @@
                 <w:b w:val="0"/>
                 <w:sz w:val="19"/>
               </w:rPr>
-              <w:t>$33,450.53 (~$33K)</w:t>
+              <w:t>$111,231.35 (~$111K)</w:t>
             </w:r>
           </w:p>
         </w:tc>
@@ -3793,7 +3793,7 @@
                 <w:b w:val="0"/>
                 <w:sz w:val="19"/>
               </w:rPr>
-              <w:t>~$33K</w:t>
+              <w:t>~$111K</w:t>
             </w:r>
           </w:p>
         </w:tc>
@@ -3814,7 +3814,7 @@
           <w:color w:val="1E7A3C"/>
           <w:sz w:val="19"/>
         </w:rPr>
-        <w:t>MATCHES — NOT FROM THE DATABASE. Source is a bundled static file: data/Google Ads.xlsx -&gt; data/ad_spend_daily.json (regenerate via scripts/build_ad_spend_json.py when the export is refreshed). The MTD figure is summed dynamically for the date window, but the spend data is static. Chain-level only (campaigns aren't location-tagged); FB sheet empty.</w:t>
+        <w:t>MATCHES — NOT FROM THE DATABASE. Source is a bundled static file: data/Google Ads.xlsx -&gt; data/ad_spend_daily.json (regenerate via scripts/build_ad_spend_json.py when refreshed). Sums the 'google' AND 'Fb' tabs only (Sheet1 is excluded to avoid double-counting). MTD figure is summed dynamically for the window; spend data is static. Chain-level only (campaigns aren't location-tagged).</w:t>
       </w:r>
     </w:p>
     <w:p>
@@ -3863,7 +3863,7 @@
                 <w:b/>
                 <w:sz w:val="19"/>
               </w:rPr>
-              <w:t>Numerator (MTD ad spend)</w:t>
+              <w:t>Numerator (MTD ad spend, Google+FB)</w:t>
             </w:r>
           </w:p>
         </w:tc>
@@ -3877,7 +3877,7 @@
                 <w:b w:val="0"/>
                 <w:sz w:val="19"/>
               </w:rPr>
-              <w:t>33,450.53</w:t>
+              <w:t>111,231.35</w:t>
             </w:r>
           </w:p>
         </w:tc>
@@ -3937,7 +3937,7 @@
                 <w:b w:val="0"/>
                 <w:sz w:val="19"/>
               </w:rPr>
-              <w:t>$55.29</w:t>
+              <w:t>$183.85</w:t>
             </w:r>
           </w:p>
         </w:tc>
@@ -3967,7 +3967,7 @@
                 <w:b w:val="0"/>
                 <w:sz w:val="19"/>
               </w:rPr>
-              <w:t>$55</w:t>
+              <w:t>~$184</w:t>
             </w:r>
           </w:p>
         </w:tc>
@@ -3988,7 +3988,7 @@
           <w:color w:val="1E7A3C"/>
           <w:sz w:val="19"/>
         </w:rPr>
-        <w:t>MATCHES — Numerator from the bundled ad-spend file; denominator (new customers) from the DB. Correct on the All-Locations view; if a single location is selected, ad spend stays chain-wide while new customers is location-scoped, so CAC is mismatched there.</w:t>
+        <w:t>MATCHES — Numerator from the bundled ad-spend file (Google + Facebook); denominator (new customers) from the DB. Correct on the All-Locations view; if a single location is selected, ad spend stays chain-wide while new customers is location-scoped, so CAC is mismatched there.</w:t>
       </w:r>
     </w:p>
     <w:p>
@@ -4253,7 +4253,7 @@
         <w:rPr>
           <w:sz w:val="20"/>
         </w:rPr>
-        <w:t>MTD Ad Spend / CAC — NEW: sourced from a bundled static file (data/Google Ads.xlsx -&gt; ad_spend_daily.json), NOT the database. Chain-level; ~$33K MTD, CAC ~$55.</w:t>
+        <w:t>MTD Ad Spend / CAC — NEW: sourced from a bundled static file (data/Google Ads.xlsx -&gt; ad_spend_daily.json), NOT the database. Google + Facebook tabs (Sheet1 excluded). Chain-level; ~$111K MTD, CAC ~$184.</w:t>
       </w:r>
     </w:p>
     <w:p>

</xml_diff>

<commit_message>
edit new customer, location total, no show, cancellation, service mix, recog revenue proj rate
</commit_message>
<xml_diff>
--- a/Evolve_Dashboard_Metric_Computations.docx
+++ b/Evolve_Dashboard_Metric_Computations.docx
@@ -615,7 +615,16 @@
           <w:color w:val="1F3955"/>
           <w:sz w:val="19"/>
         </w:rPr>
-        <w:t>SUM(sales_collected_exc_tax) on most recent payment day</w:t>
+        <w:t>SUM(CASE WHEN status='closed' THEN sales_exc_tax END)   on the latest sale day</w:t>
+      </w:r>
+      <w:r>
+        <w:rPr>
+          <w:rFonts w:ascii="Consolas" w:hAnsi="Consolas"/>
+          <w:color w:val="1F3955"/>
+          <w:sz w:val="19"/>
+        </w:rPr>
+        <w:br/>
+        <w:t xml:space="preserve">  (latest closed sale_date &lt;= end; selected locations)</w:t>
       </w:r>
     </w:p>
     <w:tbl>
@@ -639,7 +648,7 @@
                 <w:b/>
                 <w:sz w:val="19"/>
               </w:rPr>
-              <w:t>Numerator</w:t>
+              <w:t>Basis</w:t>
             </w:r>
           </w:p>
         </w:tc>
@@ -653,7 +662,7 @@
                 <w:b w:val="0"/>
                 <w:sz w:val="19"/>
               </w:rPr>
-              <w:t>75,378.45</w:t>
+              <w:t>NET SALES (accrual), not cash</w:t>
             </w:r>
           </w:p>
         </w:tc>
@@ -669,7 +678,7 @@
                 <w:b/>
                 <w:sz w:val="19"/>
               </w:rPr>
-              <w:t>Denominator</w:t>
+              <w:t>Day</w:t>
             </w:r>
           </w:p>
         </w:tc>
@@ -683,7 +692,7 @@
                 <w:b w:val="0"/>
                 <w:sz w:val="19"/>
               </w:rPr>
-              <w:t>—</w:t>
+              <w:t>latest closed sale_date</w:t>
             </w:r>
           </w:p>
         </w:tc>
@@ -699,7 +708,7 @@
                 <w:b/>
                 <w:sz w:val="19"/>
               </w:rPr>
-              <w:t>Computed value</w:t>
+              <w:t>Source</w:t>
             </w:r>
           </w:p>
         </w:tc>
@@ -713,7 +722,7 @@
                 <w:b w:val="0"/>
                 <w:sz w:val="19"/>
               </w:rPr>
-              <w:t>$75,378.45</w:t>
+              <w:t>BRONZE_ZENOTI_SALES_ACCRUAL</w:t>
             </w:r>
           </w:p>
         </w:tc>
@@ -729,7 +738,7 @@
                 <w:b/>
                 <w:sz w:val="19"/>
               </w:rPr>
-              <w:t>Dashboard shows</w:t>
+              <w:t>Example</w:t>
             </w:r>
           </w:p>
         </w:tc>
@@ -743,7 +752,7 @@
                 <w:b w:val="0"/>
                 <w:sz w:val="19"/>
               </w:rPr>
-              <w:t>$75K</w:t>
+              <w:t>Jun 27 ~ $43K</w:t>
             </w:r>
           </w:p>
         </w:tc>
@@ -764,7 +773,7 @@
           <w:color w:val="1E7A3C"/>
           <w:sz w:val="19"/>
         </w:rPr>
-        <w:t>MATCHES — Matches.</w:t>
+        <w:t>MATCHES — CHANGED to net sales. Was cash (sales_collected on latest cash day = Jun 25 = $585K batch). Now net sales on the latest sale day (Jun 27 ~ $43K), so it reflects actual sales, not a cash-collection lump.</w:t>
       </w:r>
     </w:p>
     <w:p>
@@ -1137,7 +1146,7 @@
           <w:color w:val="1F3955"/>
           <w:sz w:val="19"/>
         </w:rPr>
-        <w:t>COUNT(DISTINCT guests who bought a 'Memberships' item)</w:t>
+        <w:t>new memberships / non-member unique guests * 100</w:t>
       </w:r>
       <w:r>
         <w:rPr>
@@ -1146,181 +1155,51 @@
           <w:sz w:val="19"/>
         </w:rPr>
         <w:br/>
-        <w:t xml:space="preserve">   / COUNT(DISTINCT non-member guests) * 100</w:t>
       </w:r>
-    </w:p>
-    <w:tbl>
-      <w:tblPr>
-        <w:tblStyle w:val="TableGrid"/>
-        <w:tblW w:type="auto" w:w="0"/>
-        <w:tblLook w:firstColumn="1" w:firstRow="1" w:lastColumn="0" w:lastRow="0" w:noHBand="0" w:noVBand="1" w:val="04A0"/>
-      </w:tblPr>
-      <w:tblGrid>
-        <w:gridCol w:w="4320"/>
-        <w:gridCol w:w="4320"/>
-      </w:tblGrid>
-      <w:tr>
-        <w:tc>
-          <w:tcPr>
-            <w:tcW w:type="dxa" w:w="4320"/>
-          </w:tcPr>
-          <w:p>
-            <w:r>
-              <w:rPr>
-                <w:b/>
-                <w:sz w:val="19"/>
-              </w:rPr>
-              <w:t>Numerator (membership buyers)</w:t>
-            </w:r>
-          </w:p>
-        </w:tc>
-        <w:tc>
-          <w:tcPr>
-            <w:tcW w:type="dxa" w:w="4320"/>
-          </w:tcPr>
-          <w:p>
-            <w:r>
-              <w:rPr>
-                <w:b w:val="0"/>
-                <w:sz w:val="19"/>
-              </w:rPr>
-              <w:t>4</w:t>
-            </w:r>
-          </w:p>
-        </w:tc>
-      </w:tr>
-      <w:tr>
-        <w:tc>
-          <w:tcPr>
-            <w:tcW w:type="dxa" w:w="4320"/>
-          </w:tcPr>
-          <w:p>
-            <w:r>
-              <w:rPr>
-                <w:b/>
-                <w:sz w:val="19"/>
-              </w:rPr>
-              <w:t>Denominator (non-member guests)</w:t>
-            </w:r>
-          </w:p>
-        </w:tc>
-        <w:tc>
-          <w:tcPr>
-            <w:tcW w:type="dxa" w:w="4320"/>
-          </w:tcPr>
-          <w:p>
-            <w:r>
-              <w:rPr>
-                <w:b w:val="0"/>
-                <w:sz w:val="19"/>
-              </w:rPr>
-              <w:t>2,186</w:t>
-            </w:r>
-          </w:p>
-        </w:tc>
-      </w:tr>
-      <w:tr>
-        <w:tc>
-          <w:tcPr>
-            <w:tcW w:type="dxa" w:w="4320"/>
-          </w:tcPr>
-          <w:p>
-            <w:r>
-              <w:rPr>
-                <w:b/>
-                <w:sz w:val="19"/>
-              </w:rPr>
-              <w:t>Computed value (true)</w:t>
-            </w:r>
-          </w:p>
-        </w:tc>
-        <w:tc>
-          <w:tcPr>
-            <w:tcW w:type="dxa" w:w="4320"/>
-          </w:tcPr>
-          <w:p>
-            <w:r>
-              <w:rPr>
-                <w:b w:val="0"/>
-                <w:sz w:val="19"/>
-              </w:rPr>
-              <w:t>0.18%</w:t>
-            </w:r>
-          </w:p>
-        </w:tc>
-      </w:tr>
-      <w:tr>
-        <w:tc>
-          <w:tcPr>
-            <w:tcW w:type="dxa" w:w="4320"/>
-          </w:tcPr>
-          <w:p>
-            <w:r>
-              <w:rPr>
-                <w:b/>
-                <w:sz w:val="19"/>
-              </w:rPr>
-              <w:t>Dashboard (after deploy)</w:t>
-            </w:r>
-          </w:p>
-        </w:tc>
-        <w:tc>
-          <w:tcPr>
-            <w:tcW w:type="dxa" w:w="4320"/>
-          </w:tcPr>
-          <w:p>
-            <w:r>
-              <w:rPr>
-                <w:b w:val="0"/>
-                <w:sz w:val="19"/>
-              </w:rPr>
-              <w:t>0.18%</w:t>
-            </w:r>
-          </w:p>
-        </w:tc>
-      </w:tr>
-    </w:tbl>
-    <w:p>
-      <w:pPr>
-        <w:spacing w:after="40"/>
-      </w:pPr>
-    </w:p>
-    <w:p>
-      <w:pPr>
-        <w:spacing w:after="200"/>
-      </w:pPr>
-      <w:r>
-        <w:rPr>
-          <w:b/>
-          <w:color w:val="1E7A3C"/>
-          <w:sz w:val="19"/>
-        </w:rPr>
-        <w:t>MATCHES — FIXED (display). The dashboard's pctScale() helper used to multiply any value &lt;= 1 by 100 (assuming small numbers were fractions), turning 0.18% into 18.3%. pctScale is now a pass-through, so it renders 0.18% correctly. Note: the numerator (4) is a cash-derived proxy and may still undercount memberships created — separate data item.</w:t>
-      </w:r>
-    </w:p>
-    <w:p>
-      <w:pPr>
-        <w:pStyle w:val="Heading2"/>
-      </w:pPr>
-      <w:r>
-        <w:rPr>
-          <w:color w:val="1F3955"/>
-        </w:rPr>
-        <w:t>New Customer Visits</w:t>
-      </w:r>
-    </w:p>
-    <w:p>
-      <w:pPr>
-        <w:spacing w:after="80"/>
-        <w:ind w:left="280"/>
-      </w:pPr>
       <w:r>
         <w:rPr>
           <w:rFonts w:ascii="Consolas" w:hAnsi="Consolas"/>
           <w:color w:val="1F3955"/>
           <w:sz w:val="19"/>
         </w:rPr>
-        <w:t>COUNT(DISTINCT guest_name WHERE first_visit = 'yes')</w:t>
+        <w:br/>
+        <w:t>new memberships = COUNT(DISTINCT UserMembershipId) from Bi_DimMembershipUser_s3</w:t>
+      </w:r>
+      <w:r>
+        <w:rPr>
+          <w:rFonts w:ascii="Consolas" w:hAnsi="Consolas"/>
+          <w:color w:val="1F3955"/>
+          <w:sz w:val="19"/>
+        </w:rPr>
+        <w:br/>
+        <w:t xml:space="preserve">                  WHERE IsDeleted = 0</w:t>
+      </w:r>
+      <w:r>
+        <w:rPr>
+          <w:rFonts w:ascii="Consolas" w:hAnsi="Consolas"/>
+          <w:color w:val="1F3955"/>
+          <w:sz w:val="19"/>
+        </w:rPr>
+        <w:br/>
+        <w:t xml:space="preserve">                    AND CreationDate in the reporting month (MTD)</w:t>
+      </w:r>
+      <w:r>
+        <w:rPr>
+          <w:rFonts w:ascii="Consolas" w:hAnsi="Consolas"/>
+          <w:color w:val="1F3955"/>
+          <w:sz w:val="19"/>
+        </w:rPr>
+        <w:br/>
+        <w:t xml:space="preserve">                    AND StartDate in the same month   (created &amp; started this month)</w:t>
+      </w:r>
+      <w:r>
+        <w:rPr>
+          <w:rFonts w:ascii="Consolas" w:hAnsi="Consolas"/>
+          <w:color w:val="1F3955"/>
+          <w:sz w:val="19"/>
+        </w:rPr>
+        <w:br/>
+        <w:t>non-member guests = COUNT(DISTINCT guest_name WHERE member='no') from the cash report</w:t>
       </w:r>
     </w:p>
     <w:tbl>
@@ -1358,7 +1237,7 @@
                 <w:b w:val="0"/>
                 <w:sz w:val="19"/>
               </w:rPr>
-              <w:t>605</w:t>
+              <w:t>new memberships (Bi_DimMembershipUser_s3)</w:t>
             </w:r>
           </w:p>
         </w:tc>
@@ -1388,7 +1267,7 @@
                 <w:b w:val="0"/>
                 <w:sz w:val="19"/>
               </w:rPr>
-              <w:t>—</w:t>
+              <w:t>non-member unique guests (cash)</w:t>
             </w:r>
           </w:p>
         </w:tc>
@@ -1404,7 +1283,7 @@
                 <w:b/>
                 <w:sz w:val="19"/>
               </w:rPr>
-              <w:t>Computed value</w:t>
+              <w:t>Location key</w:t>
             </w:r>
           </w:p>
         </w:tc>
@@ -1418,7 +1297,7 @@
                 <w:b w:val="0"/>
                 <w:sz w:val="19"/>
               </w:rPr>
-              <w:t>605</w:t>
+              <w:t>membership CenterId (mapped from center_name)</w:t>
             </w:r>
           </w:p>
         </w:tc>
@@ -1434,7 +1313,7 @@
                 <w:b/>
                 <w:sz w:val="19"/>
               </w:rPr>
-              <w:t>Dashboard shows</w:t>
+              <w:t>Note</w:t>
             </w:r>
           </w:p>
         </w:tc>
@@ -1448,7 +1327,7 @@
                 <w:b w:val="0"/>
                 <w:sz w:val="19"/>
               </w:rPr>
-              <w:t>605</w:t>
+              <w:t>0 until the membership table is loaded for the current month</w:t>
             </w:r>
           </w:p>
         </w:tc>
@@ -1469,7 +1348,247 @@
           <w:color w:val="1E7A3C"/>
           <w:sz w:val="19"/>
         </w:rPr>
-        <w:t>MATCHES — Matches.</w:t>
+        <w:t>MATCHES — Numerator now from Bi_DimMembershipUser_s3 (memberships created this month AND starting this month, IsDeleted=0, counted per UserMembershipId) — replaces the old cash-line proxy. pctScale display also fixed. Reads 0 if Bi_DimMembershipUser_s3 has no current-month rows (data-freshness gap), like COGS before its data loaded.</w:t>
+      </w:r>
+    </w:p>
+    <w:p>
+      <w:pPr>
+        <w:pStyle w:val="Heading2"/>
+      </w:pPr>
+      <w:r>
+        <w:rPr>
+          <w:color w:val="1F3955"/>
+        </w:rPr>
+        <w:t>New Customer Visits</w:t>
+      </w:r>
+    </w:p>
+    <w:p>
+      <w:pPr>
+        <w:spacing w:after="80"/>
+        <w:ind w:left="280"/>
+      </w:pPr>
+      <w:r>
+        <w:rPr>
+          <w:rFonts w:ascii="Consolas" w:hAnsi="Consolas"/>
+          <w:color w:val="1F3955"/>
+          <w:sz w:val="19"/>
+        </w:rPr>
+        <w:t>COUNT(DISTINCT UserId) from Bi_FactCollections_s3 WHERE:</w:t>
+      </w:r>
+      <w:r>
+        <w:rPr>
+          <w:rFonts w:ascii="Consolas" w:hAnsi="Consolas"/>
+          <w:color w:val="1F3955"/>
+          <w:sz w:val="19"/>
+        </w:rPr>
+        <w:br/>
+        <w:t xml:space="preserve">   first sale date (MIN SaleDateInCenter per UserId) is in the reporting month</w:t>
+      </w:r>
+      <w:r>
+        <w:rPr>
+          <w:rFonts w:ascii="Consolas" w:hAnsi="Consolas"/>
+          <w:color w:val="1F3955"/>
+          <w:sz w:val="19"/>
+        </w:rPr>
+        <w:br/>
+        <w:t xml:space="preserve">   AND that first purchase is non-membership (MembershipVersionId = 'Not Applicable')</w:t>
+      </w:r>
+      <w:r>
+        <w:rPr>
+          <w:rFonts w:ascii="Consolas" w:hAnsi="Consolas"/>
+          <w:color w:val="1F3955"/>
+          <w:sz w:val="19"/>
+        </w:rPr>
+        <w:br/>
+        <w:t xml:space="preserve">   AND IsDeleted = 0, not Void, Amount &gt; 0</w:t>
+      </w:r>
+      <w:r>
+        <w:rPr>
+          <w:rFonts w:ascii="Consolas" w:hAnsi="Consolas"/>
+          <w:color w:val="1F3955"/>
+          <w:sz w:val="19"/>
+        </w:rPr>
+        <w:br/>
+        <w:t>(if the first purchase is a membership, the guest is NOT counted)</w:t>
+      </w:r>
+    </w:p>
+    <w:tbl>
+      <w:tblPr>
+        <w:tblStyle w:val="TableGrid"/>
+        <w:tblW w:type="auto" w:w="0"/>
+        <w:tblLook w:firstColumn="1" w:firstRow="1" w:lastColumn="0" w:lastRow="0" w:noHBand="0" w:noVBand="1" w:val="04A0"/>
+      </w:tblPr>
+      <w:tblGrid>
+        <w:gridCol w:w="4320"/>
+        <w:gridCol w:w="4320"/>
+      </w:tblGrid>
+      <w:tr>
+        <w:tc>
+          <w:tcPr>
+            <w:tcW w:type="dxa" w:w="4320"/>
+          </w:tcPr>
+          <w:p>
+            <w:r>
+              <w:rPr>
+                <w:b/>
+                <w:sz w:val="19"/>
+              </w:rPr>
+              <w:t>Source</w:t>
+            </w:r>
+          </w:p>
+        </w:tc>
+        <w:tc>
+          <w:tcPr>
+            <w:tcW w:type="dxa" w:w="4320"/>
+          </w:tcPr>
+          <w:p>
+            <w:r>
+              <w:rPr>
+                <w:b w:val="0"/>
+                <w:sz w:val="19"/>
+              </w:rPr>
+              <w:t>Bi_FactCollections_s3 (transaction-grain collections)</w:t>
+            </w:r>
+          </w:p>
+        </w:tc>
+      </w:tr>
+      <w:tr>
+        <w:tc>
+          <w:tcPr>
+            <w:tcW w:type="dxa" w:w="4320"/>
+          </w:tcPr>
+          <w:p>
+            <w:r>
+              <w:rPr>
+                <w:b/>
+                <w:sz w:val="19"/>
+              </w:rPr>
+              <w:t>Identifier</w:t>
+            </w:r>
+          </w:p>
+        </w:tc>
+        <w:tc>
+          <w:tcPr>
+            <w:tcW w:type="dxa" w:w="4320"/>
+          </w:tcPr>
+          <w:p>
+            <w:r>
+              <w:rPr>
+                <w:b w:val="0"/>
+                <w:sz w:val="19"/>
+              </w:rPr>
+              <w:t>distinct UserId</w:t>
+            </w:r>
+          </w:p>
+        </w:tc>
+      </w:tr>
+      <w:tr>
+        <w:tc>
+          <w:tcPr>
+            <w:tcW w:type="dxa" w:w="4320"/>
+          </w:tcPr>
+          <w:p>
+            <w:r>
+              <w:rPr>
+                <w:b/>
+                <w:sz w:val="19"/>
+              </w:rPr>
+              <w:t xml:space="preserve">New = </w:t>
+            </w:r>
+          </w:p>
+        </w:tc>
+        <w:tc>
+          <w:tcPr>
+            <w:tcW w:type="dxa" w:w="4320"/>
+          </w:tcPr>
+          <w:p>
+            <w:r>
+              <w:rPr>
+                <w:b w:val="0"/>
+                <w:sz w:val="19"/>
+              </w:rPr>
+              <w:t>first sale date this month, MembershipVersionId='Not Applicable'</w:t>
+            </w:r>
+          </w:p>
+        </w:tc>
+      </w:tr>
+      <w:tr>
+        <w:tc>
+          <w:tcPr>
+            <w:tcW w:type="dxa" w:w="4320"/>
+          </w:tcPr>
+          <w:p>
+            <w:r>
+              <w:rPr>
+                <w:b/>
+                <w:sz w:val="19"/>
+              </w:rPr>
+              <w:t>Location key</w:t>
+            </w:r>
+          </w:p>
+        </w:tc>
+        <w:tc>
+          <w:tcPr>
+            <w:tcW w:type="dxa" w:w="4320"/>
+          </w:tcPr>
+          <w:p>
+            <w:r>
+              <w:rPr>
+                <w:b w:val="0"/>
+                <w:sz w:val="19"/>
+              </w:rPr>
+              <w:t>CenterId (mapped from center_name)</w:t>
+            </w:r>
+          </w:p>
+        </w:tc>
+      </w:tr>
+      <w:tr>
+        <w:tc>
+          <w:tcPr>
+            <w:tcW w:type="dxa" w:w="4320"/>
+          </w:tcPr>
+          <w:p>
+            <w:r>
+              <w:rPr>
+                <w:b/>
+                <w:sz w:val="19"/>
+              </w:rPr>
+              <w:t>Expected output</w:t>
+            </w:r>
+          </w:p>
+        </w:tc>
+        <w:tc>
+          <w:tcPr>
+            <w:tcW w:type="dxa" w:w="4320"/>
+          </w:tcPr>
+          <w:p>
+            <w:r>
+              <w:rPr>
+                <w:b w:val="0"/>
+                <w:sz w:val="19"/>
+              </w:rPr>
+              <w:t>count of distinct new guests this month (run query to confirm)</w:t>
+            </w:r>
+          </w:p>
+        </w:tc>
+      </w:tr>
+    </w:tbl>
+    <w:p>
+      <w:pPr>
+        <w:spacing w:after="40"/>
+      </w:pPr>
+    </w:p>
+    <w:p>
+      <w:pPr>
+        <w:spacing w:after="200"/>
+      </w:pPr>
+      <w:r>
+        <w:rPr>
+          <w:b/>
+          <w:color w:val="1E7A3C"/>
+          <w:sz w:val="19"/>
+        </w:rPr>
+        <w:t>MATCHES — REDEFINED. Was distinct cash guest_name with first_visit='yes'. Now: first-ever sale date (Bi_FactCollections_s3) in the month, first purchase non-membership (MembershipVersionId = 'Not Applicable'), excluding deleted/void/$0. Also drives CAC's denominator. Existing Customer Visits is unchanged.</w:t>
       </w:r>
     </w:p>
     <w:p>
@@ -1654,7 +1773,7 @@
         <w:rPr>
           <w:color w:val="1F3955"/>
         </w:rPr>
-        <w:t>SSS Growth YoY %</w:t>
+        <w:t>SSS Growth YoY %  (Same-Store Sales)</w:t>
       </w:r>
     </w:p>
     <w:p>
@@ -1668,7 +1787,60 @@
           <w:color w:val="1F3955"/>
           <w:sz w:val="19"/>
         </w:rPr>
-        <w:t>(current_cash - prior_year_cash) / prior_year_cash * 100</w:t>
+        <w:t>SSS YoY % = ( Σ Projected Run Rate  −  Σ Prior-Year Same-Month sales )</w:t>
+      </w:r>
+      <w:r>
+        <w:rPr>
+          <w:rFonts w:ascii="Consolas" w:hAnsi="Consolas"/>
+          <w:color w:val="1F3955"/>
+          <w:sz w:val="19"/>
+        </w:rPr>
+        <w:br/>
+        <w:t xml:space="preserve">            / Σ Prior-Year Same-Month sales  × 100</w:t>
+      </w:r>
+      <w:r>
+        <w:rPr>
+          <w:rFonts w:ascii="Consolas" w:hAnsi="Consolas"/>
+          <w:color w:val="1F3955"/>
+          <w:sz w:val="19"/>
+        </w:rPr>
+        <w:br/>
+        <w:t>over SAME-STORE locations only (open &gt; 12 months).</w:t>
+      </w:r>
+      <w:r>
+        <w:rPr>
+          <w:rFonts w:ascii="Consolas" w:hAnsi="Consolas"/>
+          <w:color w:val="1F3955"/>
+          <w:sz w:val="19"/>
+        </w:rPr>
+        <w:br/>
+      </w:r>
+      <w:r>
+        <w:rPr>
+          <w:rFonts w:ascii="Consolas" w:hAnsi="Consolas"/>
+          <w:color w:val="1F3955"/>
+          <w:sz w:val="19"/>
+        </w:rPr>
+        <w:br/>
+        <w:t>Projected Run Rate (per loc) = (MTD cash / working days elapsed) × total working days</w:t>
+      </w:r>
+      <w:r>
+        <w:rPr>
+          <w:rFonts w:ascii="Consolas" w:hAnsi="Consolas"/>
+          <w:color w:val="1F3955"/>
+          <w:sz w:val="19"/>
+        </w:rPr>
+        <w:br/>
+        <w:t>Prior-Year Same-Month (per loc) = full prior-year calendar-month cash</w:t>
+      </w:r>
+      <w:r>
+        <w:rPr>
+          <w:rFonts w:ascii="Consolas" w:hAnsi="Consolas"/>
+          <w:color w:val="1F3955"/>
+          <w:sz w:val="19"/>
+        </w:rPr>
+        <w:br/>
+        <w:t>Same-store = first cash date on/before (month start − 12 months)</w:t>
       </w:r>
     </w:p>
     <w:tbl>
@@ -1692,7 +1864,7 @@
                 <w:b/>
                 <w:sz w:val="19"/>
               </w:rPr>
-              <w:t>Numerator (current cash)</w:t>
+              <w:t>Numerator</w:t>
             </w:r>
           </w:p>
         </w:tc>
@@ -1706,7 +1878,7 @@
                 <w:b w:val="0"/>
                 <w:sz w:val="19"/>
               </w:rPr>
-              <w:t>1,297,752.54</w:t>
+              <w:t>Σ projected full-month run rate (same-store)</w:t>
             </w:r>
           </w:p>
         </w:tc>
@@ -1722,7 +1894,7 @@
                 <w:b/>
                 <w:sz w:val="19"/>
               </w:rPr>
-              <w:t>Denominator (prior-year, capped to latest data day)</w:t>
+              <w:t>Denominator</w:t>
             </w:r>
           </w:p>
         </w:tc>
@@ -1736,7 +1908,7 @@
                 <w:b w:val="0"/>
                 <w:sz w:val="19"/>
               </w:rPr>
-              <w:t>1,277,268.57</w:t>
+              <w:t>Σ prior-year same FULL month cash (same-store)</w:t>
             </w:r>
           </w:p>
         </w:tc>
@@ -1752,7 +1924,7 @@
                 <w:b/>
                 <w:sz w:val="19"/>
               </w:rPr>
-              <w:t>Computed value</w:t>
+              <w:t>Same-store filter</w:t>
             </w:r>
           </w:p>
         </w:tc>
@@ -1766,7 +1938,7 @@
                 <w:b w:val="0"/>
                 <w:sz w:val="19"/>
               </w:rPr>
-              <w:t>+1.6%</w:t>
+              <w:t>open &gt; 12 months (first cash ≤ month start − 12 mo)</w:t>
             </w:r>
           </w:p>
         </w:tc>
@@ -1782,7 +1954,7 @@
                 <w:b/>
                 <w:sz w:val="19"/>
               </w:rPr>
-              <w:t>Dashboard (after deploy)</w:t>
+              <w:t>Basis</w:t>
             </w:r>
           </w:p>
         </w:tc>
@@ -1796,7 +1968,7 @@
                 <w:b w:val="0"/>
                 <w:sz w:val="19"/>
               </w:rPr>
-              <w:t>+1.6%</w:t>
+              <w:t>cash; working-days run rate</w:t>
             </w:r>
           </w:p>
         </w:tc>
@@ -1817,7 +1989,7 @@
           <w:color w:val="1E7A3C"/>
           <w:sz w:val="19"/>
         </w:rPr>
-        <w:t>MATCHES — FIXED. Root cause confirmed: the prior-year window ran to MONTH-END ($1,421,516.91 = full June 2025) while the current month is partial (through ~the 26th, $1,297,752.54), giving a false -8.7%. py_end now anchors to the latest current-data day, so both sides cover equal days (Jun 1-26). Like-for-like YoY is +1.6%.</w:t>
+        <w:t>MATCHES — REDEFINED to a proper Same-Store metric: projected full-month run rate vs prior-year full same-month, restricted to locations open &gt; 12 months (those with a comparable prior year). Both sides are full-month, so no partial-vs-full skew. New-store locations are excluded. Helper: utils/sss.py (field same_store_yoy).</w:t>
       </w:r>
     </w:p>
     <w:p>
@@ -2447,7 +2619,16 @@
           <w:color w:val="1F3955"/>
           <w:sz w:val="19"/>
         </w:rPr>
-        <w:t>DISTINCT no-show invoices / DISTINCT non-deleted invoices * 100   (add_on='No')</w:t>
+        <w:t>DISTINCT invoices WHERE status IN ('no show','closed no show')</w:t>
+      </w:r>
+      <w:r>
+        <w:rPr>
+          <w:rFonts w:ascii="Consolas" w:hAnsi="Consolas"/>
+          <w:color w:val="1F3955"/>
+          <w:sz w:val="19"/>
+        </w:rPr>
+        <w:br/>
+        <w:t xml:space="preserve">   / DISTINCT non-deleted invoices * 100   (add_on='No')</w:t>
       </w:r>
     </w:p>
     <w:tbl>
@@ -2471,7 +2652,7 @@
                 <w:b/>
                 <w:sz w:val="19"/>
               </w:rPr>
-              <w:t>Numerator (no-show invoices)</w:t>
+              <w:t>Numerator (no-show + closed-no-show)</w:t>
             </w:r>
           </w:p>
         </w:tc>
@@ -2485,7 +2666,7 @@
                 <w:b w:val="0"/>
                 <w:sz w:val="19"/>
               </w:rPr>
-              <w:t>31</w:t>
+              <w:t>33</w:t>
             </w:r>
           </w:p>
         </w:tc>
@@ -2515,7 +2696,7 @@
                 <w:b w:val="0"/>
                 <w:sz w:val="19"/>
               </w:rPr>
-              <w:t>5,203</w:t>
+              <w:t>6,419</w:t>
             </w:r>
           </w:p>
         </w:tc>
@@ -2545,7 +2726,7 @@
                 <w:b w:val="0"/>
                 <w:sz w:val="19"/>
               </w:rPr>
-              <w:t>0.60%</w:t>
+              <w:t>0.51%</w:t>
             </w:r>
           </w:p>
         </w:tc>
@@ -2575,7 +2756,7 @@
                 <w:b w:val="0"/>
                 <w:sz w:val="19"/>
               </w:rPr>
-              <w:t>0.6%</w:t>
+              <w:t>0.5%</w:t>
             </w:r>
           </w:p>
         </w:tc>
@@ -2596,7 +2777,7 @@
           <w:color w:val="1E7A3C"/>
           <w:sz w:val="19"/>
         </w:rPr>
-        <w:t>MATCHES — Matches.</w:t>
+        <w:t>MATCHES — Numerator includes 'no show' AND 'closed no show'. Verified Jun 2026: 33 / 6,419 = 0.51%.</w:t>
       </w:r>
     </w:p>
     <w:p>
@@ -2621,7 +2802,16 @@
           <w:color w:val="1F3955"/>
           <w:sz w:val="19"/>
         </w:rPr>
-        <w:t>DISTINCT cancelled invoices / DISTINCT non-deleted invoices * 100   (add_on='No')</w:t>
+        <w:t>DISTINCT invoices WHERE status IN ('cancelled','closed cancellation')</w:t>
+      </w:r>
+      <w:r>
+        <w:rPr>
+          <w:rFonts w:ascii="Consolas" w:hAnsi="Consolas"/>
+          <w:color w:val="1F3955"/>
+          <w:sz w:val="19"/>
+        </w:rPr>
+        <w:br/>
+        <w:t xml:space="preserve">   / DISTINCT non-deleted invoices * 100   (add_on='No')</w:t>
       </w:r>
     </w:p>
     <w:tbl>
@@ -2645,7 +2835,7 @@
                 <w:b/>
                 <w:sz w:val="19"/>
               </w:rPr>
-              <w:t>Numerator (cancelled invoices)</w:t>
+              <w:t>Numerator (cancelled + closed-cancellation)</w:t>
             </w:r>
           </w:p>
         </w:tc>
@@ -2659,7 +2849,7 @@
                 <w:b w:val="0"/>
                 <w:sz w:val="19"/>
               </w:rPr>
-              <w:t>1,120</w:t>
+              <w:t>1,283</w:t>
             </w:r>
           </w:p>
         </w:tc>
@@ -2689,7 +2879,7 @@
                 <w:b w:val="0"/>
                 <w:sz w:val="19"/>
               </w:rPr>
-              <w:t>5,203</w:t>
+              <w:t>6,419</w:t>
             </w:r>
           </w:p>
         </w:tc>
@@ -2719,7 +2909,7 @@
                 <w:b w:val="0"/>
                 <w:sz w:val="19"/>
               </w:rPr>
-              <w:t>21.53%</w:t>
+              <w:t>19.99%</w:t>
             </w:r>
           </w:p>
         </w:tc>
@@ -2749,7 +2939,7 @@
                 <w:b w:val="0"/>
                 <w:sz w:val="19"/>
               </w:rPr>
-              <w:t>21.5%</w:t>
+              <w:t>20.0%</w:t>
             </w:r>
           </w:p>
         </w:tc>
@@ -2770,7 +2960,7 @@
           <w:color w:val="1E7A3C"/>
           <w:sz w:val="19"/>
         </w:rPr>
-        <w:t>MATCHES — Matches.</w:t>
+        <w:t>MATCHES — Numerator includes 'cancelled' AND 'closed cancellation'. Verified Jun 2026: 1,283 / 6,419 = 19.99% (~20.0%).</w:t>
       </w:r>
     </w:p>
     <w:p>
@@ -3999,6 +4189,282 @@
         <w:rPr>
           <w:color w:val="1F3955"/>
         </w:rPr>
+        <w:t>Service Mix (sub-segment 1 -&gt; sub-segment 2)</w:t>
+      </w:r>
+    </w:p>
+    <w:p>
+      <w:pPr>
+        <w:spacing w:after="80"/>
+        <w:ind w:left="280"/>
+      </w:pPr>
+      <w:r>
+        <w:rPr>
+          <w:rFonts w:ascii="Consolas" w:hAnsi="Consolas"/>
+          <w:color w:val="1F3955"/>
+          <w:sz w:val="19"/>
+        </w:rPr>
+        <w:t>-- one row per (sub-segment 1, sub-segment 2); services only</w:t>
+      </w:r>
+      <w:r>
+        <w:rPr>
+          <w:rFonts w:ascii="Consolas" w:hAnsi="Consolas"/>
+          <w:color w:val="1F3955"/>
+          <w:sz w:val="19"/>
+        </w:rPr>
+        <w:br/>
+        <w:t>SELECT item_category                         AS segment1,   -- sub-segment 1</w:t>
+      </w:r>
+      <w:r>
+        <w:rPr>
+          <w:rFonts w:ascii="Consolas" w:hAnsi="Consolas"/>
+          <w:color w:val="1F3955"/>
+          <w:sz w:val="19"/>
+        </w:rPr>
+        <w:br/>
+        <w:t xml:space="preserve">       COALESCE(item_sub_category,'(none)')  AS segment2,   -- sub-segment 2</w:t>
+      </w:r>
+      <w:r>
+        <w:rPr>
+          <w:rFonts w:ascii="Consolas" w:hAnsi="Consolas"/>
+          <w:color w:val="1F3955"/>
+          <w:sz w:val="19"/>
+        </w:rPr>
+        <w:br/>
+        <w:t xml:space="preserve">       SUM(sales_exc_tax)                    AS revenue,</w:t>
+      </w:r>
+      <w:r>
+        <w:rPr>
+          <w:rFonts w:ascii="Consolas" w:hAnsi="Consolas"/>
+          <w:color w:val="1F3955"/>
+          <w:sz w:val="19"/>
+        </w:rPr>
+        <w:br/>
+        <w:t xml:space="preserve">       COUNT(*)                              AS count</w:t>
+      </w:r>
+      <w:r>
+        <w:rPr>
+          <w:rFonts w:ascii="Consolas" w:hAnsi="Consolas"/>
+          <w:color w:val="1F3955"/>
+          <w:sz w:val="19"/>
+        </w:rPr>
+        <w:br/>
+        <w:t>FROM   BRONZE_ZENOTI_SALES_ACCRUAL</w:t>
+      </w:r>
+      <w:r>
+        <w:rPr>
+          <w:rFonts w:ascii="Consolas" w:hAnsi="Consolas"/>
+          <w:color w:val="1F3955"/>
+          <w:sz w:val="19"/>
+        </w:rPr>
+        <w:br/>
+        <w:t>WHERE  &lt;date/location&gt; AND item_type = 'Service' AND item_category IS NOT NULL</w:t>
+      </w:r>
+      <w:r>
+        <w:rPr>
+          <w:rFonts w:ascii="Consolas" w:hAnsi="Consolas"/>
+          <w:color w:val="1F3955"/>
+          <w:sz w:val="19"/>
+        </w:rPr>
+        <w:br/>
+        <w:t>GROUP BY item_category, item_sub_category</w:t>
+      </w:r>
+      <w:r>
+        <w:rPr>
+          <w:rFonts w:ascii="Consolas" w:hAnsi="Consolas"/>
+          <w:color w:val="1F3955"/>
+          <w:sz w:val="19"/>
+        </w:rPr>
+        <w:br/>
+        <w:t>ORDER BY revenue DESC</w:t>
+      </w:r>
+    </w:p>
+    <w:tbl>
+      <w:tblPr>
+        <w:tblStyle w:val="TableGrid"/>
+        <w:tblW w:type="auto" w:w="0"/>
+        <w:tblLook w:firstColumn="1" w:firstRow="1" w:lastColumn="0" w:lastRow="0" w:noHBand="0" w:noVBand="1" w:val="04A0"/>
+      </w:tblPr>
+      <w:tblGrid>
+        <w:gridCol w:w="4320"/>
+        <w:gridCol w:w="4320"/>
+      </w:tblGrid>
+      <w:tr>
+        <w:tc>
+          <w:tcPr>
+            <w:tcW w:type="dxa" w:w="4320"/>
+          </w:tcPr>
+          <w:p>
+            <w:r>
+              <w:rPr>
+                <w:b/>
+                <w:sz w:val="19"/>
+              </w:rPr>
+              <w:t>Sub-segment 1</w:t>
+            </w:r>
+          </w:p>
+        </w:tc>
+        <w:tc>
+          <w:tcPr>
+            <w:tcW w:type="dxa" w:w="4320"/>
+          </w:tcPr>
+          <w:p>
+            <w:r>
+              <w:rPr>
+                <w:b w:val="0"/>
+                <w:sz w:val="19"/>
+              </w:rPr>
+              <w:t>item_category (default donut + legend)</w:t>
+            </w:r>
+          </w:p>
+        </w:tc>
+      </w:tr>
+      <w:tr>
+        <w:tc>
+          <w:tcPr>
+            <w:tcW w:type="dxa" w:w="4320"/>
+          </w:tcPr>
+          <w:p>
+            <w:r>
+              <w:rPr>
+                <w:b/>
+                <w:sz w:val="19"/>
+              </w:rPr>
+              <w:t>Sub-segment 2</w:t>
+            </w:r>
+          </w:p>
+        </w:tc>
+        <w:tc>
+          <w:tcPr>
+            <w:tcW w:type="dxa" w:w="4320"/>
+          </w:tcPr>
+          <w:p>
+            <w:r>
+              <w:rPr>
+                <w:b w:val="0"/>
+                <w:sz w:val="19"/>
+              </w:rPr>
+              <w:t>item_sub_category (drill-down within a segment 1)</w:t>
+            </w:r>
+          </w:p>
+        </w:tc>
+      </w:tr>
+      <w:tr>
+        <w:tc>
+          <w:tcPr>
+            <w:tcW w:type="dxa" w:w="4320"/>
+          </w:tcPr>
+          <w:p>
+            <w:r>
+              <w:rPr>
+                <w:b/>
+                <w:sz w:val="19"/>
+              </w:rPr>
+              <w:t>Filter</w:t>
+            </w:r>
+          </w:p>
+        </w:tc>
+        <w:tc>
+          <w:tcPr>
+            <w:tcW w:type="dxa" w:w="4320"/>
+          </w:tcPr>
+          <w:p>
+            <w:r>
+              <w:rPr>
+                <w:b w:val="0"/>
+                <w:sz w:val="19"/>
+              </w:rPr>
+              <w:t>item_type = 'Service' AND item_category IS NOT NULL</w:t>
+            </w:r>
+          </w:p>
+        </w:tc>
+      </w:tr>
+      <w:tr>
+        <w:tc>
+          <w:tcPr>
+            <w:tcW w:type="dxa" w:w="4320"/>
+          </w:tcPr>
+          <w:p>
+            <w:r>
+              <w:rPr>
+                <w:b/>
+                <w:sz w:val="19"/>
+              </w:rPr>
+              <w:t>Metric</w:t>
+            </w:r>
+          </w:p>
+        </w:tc>
+        <w:tc>
+          <w:tcPr>
+            <w:tcW w:type="dxa" w:w="4320"/>
+          </w:tcPr>
+          <w:p>
+            <w:r>
+              <w:rPr>
+                <w:b w:val="0"/>
+                <w:sz w:val="19"/>
+              </w:rPr>
+              <w:t>revenue share = SUM(sales_exc_tax) per segment / total</w:t>
+            </w:r>
+          </w:p>
+        </w:tc>
+      </w:tr>
+      <w:tr>
+        <w:tc>
+          <w:tcPr>
+            <w:tcW w:type="dxa" w:w="4320"/>
+          </w:tcPr>
+          <w:p>
+            <w:r>
+              <w:rPr>
+                <w:b/>
+                <w:sz w:val="19"/>
+              </w:rPr>
+              <w:t>Source</w:t>
+            </w:r>
+          </w:p>
+        </w:tc>
+        <w:tc>
+          <w:tcPr>
+            <w:tcW w:type="dxa" w:w="4320"/>
+          </w:tcPr>
+          <w:p>
+            <w:r>
+              <w:rPr>
+                <w:b w:val="0"/>
+                <w:sz w:val="19"/>
+              </w:rPr>
+              <w:t>BRONZE_ZENOTI_SALES_ACCRUAL (DB)</w:t>
+            </w:r>
+          </w:p>
+        </w:tc>
+      </w:tr>
+    </w:tbl>
+    <w:p>
+      <w:pPr>
+        <w:spacing w:after="40"/>
+      </w:pPr>
+    </w:p>
+    <w:p>
+      <w:pPr>
+        <w:spacing w:after="200"/>
+      </w:pPr>
+      <w:r>
+        <w:rPr>
+          <w:b/>
+          <w:color w:val="1E7A3C"/>
+          <w:sz w:val="19"/>
+        </w:rPr>
+        <w:t>MATCHES — Endpoint /api/service-mix. Donut + legend show sub-segment 1 (item_category) by revenue share; clicking a segment drills into its sub-segment 2 (item_sub_category) breakdown, with a back link to all services. Services only (excludes Retail / Memberships / packages). Donut center shows the top slice at the current level.</w:t>
+      </w:r>
+    </w:p>
+    <w:p>
+      <w:pPr>
+        <w:pStyle w:val="Heading2"/>
+      </w:pPr>
+      <w:r>
+        <w:rPr>
+          <w:color w:val="1F3955"/>
+        </w:rPr>
         <w:t>Product Mix (unit consumption)</w:t>
       </w:r>
     </w:p>
@@ -4231,7 +4697,7 @@
         <w:rPr>
           <w:sz w:val="20"/>
         </w:rPr>
-        <w:t>Membership Adoption % — FIXED in evolve-dashboard.jsx: pctScale() is now a pass-through, so 0.18% no longer renders as 18.3%. (Numerator may still undercount memberships — separate item.)</w:t>
+        <w:t>Membership Adoption % — numerator now from Bi_DimMembershipUser_s3 (memberships created + started this month, IsDeleted=0) / non-member cash guests; pctScale display also fixed. Reads 0 until that table is loaded for the current month.</w:t>
       </w:r>
     </w:p>
     <w:p>
@@ -4242,7 +4708,18 @@
         <w:rPr>
           <w:sz w:val="20"/>
         </w:rPr>
-        <w:t>SSS Growth YoY % — FIXED in routers/mtd.py: py_end anchors to the latest current-data day, not month-end, so partial current is compared to an equal prior-year window. Goes from -8.7% to +1.6%.</w:t>
+        <w:t>SSS Growth YoY % — REDEFINED (utils/sss.py): projected full-month run rate vs prior-year full same-month, same-store only (locations open &gt; 12 months). Replaces the partial-MTD comparison.</w:t>
+      </w:r>
+    </w:p>
+    <w:p>
+      <w:pPr>
+        <w:pStyle w:val="ListBullet"/>
+      </w:pPr>
+      <w:r>
+        <w:rPr>
+          <w:sz w:val="20"/>
+        </w:rPr>
+        <w:t>Prior Day Sales — switched to NET SALES on the latest sale day (was cash on the latest cash day, which surfaced the Jun 25 $585K cash batch).</w:t>
       </w:r>
     </w:p>
     <w:p>
@@ -4265,6 +4742,17 @@
           <w:sz w:val="20"/>
         </w:rPr>
         <w:t>Product Mix — NEW: by product_name + unit consumption from BRONZE_ZENOTI_COST_OF_GOODS, with Dysport qty / 3. Was previously a single 'Retail' category row.</w:t>
+      </w:r>
+    </w:p>
+    <w:p>
+      <w:pPr>
+        <w:pStyle w:val="ListBullet"/>
+      </w:pPr>
+      <w:r>
+        <w:rPr>
+          <w:sz w:val="20"/>
+        </w:rPr>
+        <w:t>Service Mix — NEW: revenue share by sub-segment 1 (item_category) with drill-down into sub-segment 2 (item_sub_category). Services only. Endpoint /api/service-mix.</w:t>
       </w:r>
     </w:p>
     <w:p>

</xml_diff>

<commit_message>
edit location performance table
</commit_message>
<xml_diff>
--- a/Evolve_Dashboard_Metric_Computations.docx
+++ b/Evolve_Dashboard_Metric_Computations.docx
@@ -831,7 +831,7 @@
                 <w:b/>
                 <w:sz w:val="19"/>
               </w:rPr>
-              <w:t>Numerator</w:t>
+              <w:t>Numerator (new-cust non-mbr MTD sales)</w:t>
             </w:r>
           </w:p>
         </w:tc>
@@ -845,7 +845,7 @@
                 <w:b w:val="0"/>
                 <w:sz w:val="19"/>
               </w:rPr>
-              <w:t>Σ sales_exc_tax of new customers, non-membership, MTD</w:t>
+              <w:t>≈ $366,033</w:t>
             </w:r>
           </w:p>
         </w:tc>
@@ -861,7 +861,7 @@
                 <w:b/>
                 <w:sz w:val="19"/>
               </w:rPr>
-              <w:t>Denominator</w:t>
+              <w:t>Denominator (New Customer Visits)</w:t>
             </w:r>
           </w:p>
         </w:tc>
@@ -875,7 +875,7 @@
                 <w:b w:val="0"/>
                 <w:sz w:val="19"/>
               </w:rPr>
-              <w:t>New Customer Visits (distinct new customers)</w:t>
+              <w:t>1,134</w:t>
             </w:r>
           </w:p>
         </w:tc>
@@ -891,7 +891,7 @@
                 <w:b/>
                 <w:sz w:val="19"/>
               </w:rPr>
-              <w:t>Basis</w:t>
+              <w:t>Computed value</w:t>
             </w:r>
           </w:p>
         </w:tc>
@@ -905,7 +905,7 @@
                 <w:b w:val="0"/>
                 <w:sz w:val="19"/>
               </w:rPr>
-              <w:t>sales accrual; per customer</w:t>
+              <w:t>$322.78</w:t>
             </w:r>
           </w:p>
         </w:tc>
@@ -921,7 +921,7 @@
                 <w:b/>
                 <w:sz w:val="19"/>
               </w:rPr>
-              <w:t>Source</w:t>
+              <w:t>Dashboard shows</w:t>
             </w:r>
           </w:p>
         </w:tc>
@@ -935,7 +935,37 @@
                 <w:b w:val="0"/>
                 <w:sz w:val="19"/>
               </w:rPr>
-              <w:t>BRONZE_ZENOTI_SALES_ACCRUAL</w:t>
+              <w:t>$323</w:t>
+            </w:r>
+          </w:p>
+        </w:tc>
+      </w:tr>
+      <w:tr>
+        <w:tc>
+          <w:tcPr>
+            <w:tcW w:type="dxa" w:w="4320"/>
+          </w:tcPr>
+          <w:p>
+            <w:r>
+              <w:rPr>
+                <w:b/>
+                <w:sz w:val="19"/>
+              </w:rPr>
+              <w:t>Basis / source</w:t>
+            </w:r>
+          </w:p>
+        </w:tc>
+        <w:tc>
+          <w:tcPr>
+            <w:tcW w:type="dxa" w:w="4320"/>
+          </w:tcPr>
+          <w:p>
+            <w:r>
+              <w:rPr>
+                <w:b w:val="0"/>
+                <w:sz w:val="19"/>
+              </w:rPr>
+              <w:t>sales accrual, per customer (BRONZE_ZENOTI_SALES_ACCRUAL)</w:t>
             </w:r>
           </w:p>
         </w:tc>
@@ -956,7 +986,7 @@
           <w:color w:val="1E7A3C"/>
           <w:sz w:val="19"/>
         </w:rPr>
-        <w:t>MATCHES — SWITCHED to sales-accrual per-customer. Was cash / new-flagged (first_visit) guest-day visits — a different 'new' pool than the New Customer Visits card. Now numerator and denominator use the SAME sales-accrual new/existing classification (first-ever sale date), so ASP New × New Customer Visits = new-customer sales. Falls back to the cash ASP if the scan doesn't finish within the header cap.</w:t>
+        <w:t>MATCHES — VERIFIED (Jun 2026): $322.78 ≈ $323. SWITCHED to sales-accrual per-customer — was cash / new-flagged (first_visit) guest-day visits, a different 'new' pool than the New Customer Visits card. Numerator and denominator now use the SAME sales-accrual new/existing classification (first-ever sale date), so ASP New × New Customer Visits = new-customer sales. Falls back to the cash ASP if the scan doesn't finish within the header cap.</w:t>
       </w:r>
     </w:p>
     <w:p>
@@ -1014,7 +1044,7 @@
                 <w:b/>
                 <w:sz w:val="19"/>
               </w:rPr>
-              <w:t>Numerator</w:t>
+              <w:t>Numerator (existing non-mbr MTD sales)</w:t>
             </w:r>
           </w:p>
         </w:tc>
@@ -1028,7 +1058,7 @@
                 <w:b w:val="0"/>
                 <w:sz w:val="19"/>
               </w:rPr>
-              <w:t>Σ sales_exc_tax of existing customers, non-membership, MTD</w:t>
+              <w:t>≈ $1,349,701</w:t>
             </w:r>
           </w:p>
         </w:tc>
@@ -1044,7 +1074,7 @@
                 <w:b/>
                 <w:sz w:val="19"/>
               </w:rPr>
-              <w:t>Denominator</w:t>
+              <w:t>Denominator (Existing Customer Visits)</w:t>
             </w:r>
           </w:p>
         </w:tc>
@@ -1058,7 +1088,7 @@
                 <w:b w:val="0"/>
                 <w:sz w:val="19"/>
               </w:rPr>
-              <w:t>Existing Customer Visits (distinct existing customers)</w:t>
+              <w:t>3,385</w:t>
             </w:r>
           </w:p>
         </w:tc>
@@ -1074,7 +1104,7 @@
                 <w:b/>
                 <w:sz w:val="19"/>
               </w:rPr>
-              <w:t>Basis</w:t>
+              <w:t>Computed value</w:t>
             </w:r>
           </w:p>
         </w:tc>
@@ -1088,7 +1118,7 @@
                 <w:b w:val="0"/>
                 <w:sz w:val="19"/>
               </w:rPr>
-              <w:t>sales accrual; per customer</w:t>
+              <w:t>$398.73</w:t>
             </w:r>
           </w:p>
         </w:tc>
@@ -1104,7 +1134,7 @@
                 <w:b/>
                 <w:sz w:val="19"/>
               </w:rPr>
-              <w:t>Source</w:t>
+              <w:t>Dashboard shows</w:t>
             </w:r>
           </w:p>
         </w:tc>
@@ -1118,7 +1148,37 @@
                 <w:b w:val="0"/>
                 <w:sz w:val="19"/>
               </w:rPr>
-              <w:t>BRONZE_ZENOTI_SALES_ACCRUAL</w:t>
+              <w:t>$399</w:t>
+            </w:r>
+          </w:p>
+        </w:tc>
+      </w:tr>
+      <w:tr>
+        <w:tc>
+          <w:tcPr>
+            <w:tcW w:type="dxa" w:w="4320"/>
+          </w:tcPr>
+          <w:p>
+            <w:r>
+              <w:rPr>
+                <w:b/>
+                <w:sz w:val="19"/>
+              </w:rPr>
+              <w:t>Basis / source</w:t>
+            </w:r>
+          </w:p>
+        </w:tc>
+        <w:tc>
+          <w:tcPr>
+            <w:tcW w:type="dxa" w:w="4320"/>
+          </w:tcPr>
+          <w:p>
+            <w:r>
+              <w:rPr>
+                <w:b w:val="0"/>
+                <w:sz w:val="19"/>
+              </w:rPr>
+              <w:t>sales accrual, per customer (BRONZE_ZENOTI_SALES_ACCRUAL)</w:t>
             </w:r>
           </w:p>
         </w:tc>
@@ -1139,7 +1199,7 @@
           <w:color w:val="1E7A3C"/>
           <w:sz w:val="19"/>
         </w:rPr>
-        <w:t>MATCHES — SWITCHED to sales-accrual per-customer (same change as ASP New). Existing = first-ever sale before this month; ASP Existing × Existing Customer Visits = existing-customer sales.</w:t>
+        <w:t>MATCHES — VERIFIED (Jun 2026): $398.73 ≈ $399. SWITCHED to sales-accrual per-customer (same change as ASP New). Existing = first-ever sale before this month; ASP Existing × Existing Customer Visits = existing-customer sales. Existing ($399) &gt; New ($323) is expected — returning customers spend more per head than first-timers.</w:t>
       </w:r>
     </w:p>
     <w:p>
@@ -1223,7 +1283,7 @@
                 <w:b/>
                 <w:sz w:val="19"/>
               </w:rPr>
-              <w:t>Numerator</w:t>
+              <w:t>Numerator (new members, cash)</w:t>
             </w:r>
           </w:p>
         </w:tc>
@@ -1237,7 +1297,7 @@
                 <w:b w:val="0"/>
                 <w:sz w:val="19"/>
               </w:rPr>
-              <w:t>new members — membership purchases this month (cash)</w:t>
+              <w:t>4</w:t>
             </w:r>
           </w:p>
         </w:tc>
@@ -1253,7 +1313,7 @@
                 <w:b/>
                 <w:sz w:val="19"/>
               </w:rPr>
-              <w:t>Denominator</w:t>
+              <w:t>Denominator (non-member guests)</w:t>
             </w:r>
           </w:p>
         </w:tc>
@@ -1267,7 +1327,37 @@
                 <w:b w:val="0"/>
                 <w:sz w:val="19"/>
               </w:rPr>
-              <w:t>non-member unique guests (cash, member='no')</w:t>
+              <w:t>2,926</w:t>
+            </w:r>
+          </w:p>
+        </w:tc>
+      </w:tr>
+      <w:tr>
+        <w:tc>
+          <w:tcPr>
+            <w:tcW w:type="dxa" w:w="4320"/>
+          </w:tcPr>
+          <w:p>
+            <w:r>
+              <w:rPr>
+                <w:b/>
+                <w:sz w:val="19"/>
+              </w:rPr>
+              <w:t>Computed value (Jun 2026)</w:t>
+            </w:r>
+          </w:p>
+        </w:tc>
+        <w:tc>
+          <w:tcPr>
+            <w:tcW w:type="dxa" w:w="4320"/>
+          </w:tcPr>
+          <w:p>
+            <w:r>
+              <w:rPr>
+                <w:b w:val="0"/>
+                <w:sz w:val="19"/>
+              </w:rPr>
+              <w:t>0.14%</w:t>
             </w:r>
           </w:p>
         </w:tc>
@@ -1297,37 +1387,7 @@
                 <w:b w:val="0"/>
                 <w:sz w:val="19"/>
               </w:rPr>
-              <w:t>BRONZE_ZENOTI_CASH_COLLECTIONS (computed in the main KPI query)</w:t>
-            </w:r>
-          </w:p>
-        </w:tc>
-      </w:tr>
-      <w:tr>
-        <w:tc>
-          <w:tcPr>
-            <w:tcW w:type="dxa" w:w="4320"/>
-          </w:tcPr>
-          <w:p>
-            <w:r>
-              <w:rPr>
-                <w:b/>
-                <w:sz w:val="19"/>
-              </w:rPr>
-              <w:t>Location key</w:t>
-            </w:r>
-          </w:p>
-        </w:tc>
-        <w:tc>
-          <w:tcPr>
-            <w:tcW w:type="dxa" w:w="4320"/>
-          </w:tcPr>
-          <w:p>
-            <w:r>
-              <w:rPr>
-                <w:b w:val="0"/>
-                <w:sz w:val="19"/>
-              </w:rPr>
-              <w:t>center_name (direct)</w:t>
+              <w:t>BRONZE_ZENOTI_CASH_COLLECTIONS (main KPI query)</w:t>
             </w:r>
           </w:p>
         </w:tc>
@@ -1454,36 +1514,6 @@
                 <w:b/>
                 <w:sz w:val="19"/>
               </w:rPr>
-              <w:t>Identifier</w:t>
-            </w:r>
-          </w:p>
-        </w:tc>
-        <w:tc>
-          <w:tcPr>
-            <w:tcW w:type="dxa" w:w="4320"/>
-          </w:tcPr>
-          <w:p>
-            <w:r>
-              <w:rPr>
-                <w:b w:val="0"/>
-                <w:sz w:val="19"/>
-              </w:rPr>
-              <w:t>distinct guest_name</w:t>
-            </w:r>
-          </w:p>
-        </w:tc>
-      </w:tr>
-      <w:tr>
-        <w:tc>
-          <w:tcPr>
-            <w:tcW w:type="dxa" w:w="4320"/>
-          </w:tcPr>
-          <w:p>
-            <w:r>
-              <w:rPr>
-                <w:b/>
-                <w:sz w:val="19"/>
-              </w:rPr>
               <w:t xml:space="preserve">New = </w:t>
             </w:r>
           </w:p>
@@ -1544,6 +1574,36 @@
                 <w:b/>
                 <w:sz w:val="19"/>
               </w:rPr>
+              <w:t>Value (Jun 2026)</w:t>
+            </w:r>
+          </w:p>
+        </w:tc>
+        <w:tc>
+          <w:tcPr>
+            <w:tcW w:type="dxa" w:w="4320"/>
+          </w:tcPr>
+          <w:p>
+            <w:r>
+              <w:rPr>
+                <w:b w:val="0"/>
+                <w:sz w:val="19"/>
+              </w:rPr>
+              <w:t>1,134</w:t>
+            </w:r>
+          </w:p>
+        </w:tc>
+      </w:tr>
+      <w:tr>
+        <w:tc>
+          <w:tcPr>
+            <w:tcW w:type="dxa" w:w="4320"/>
+          </w:tcPr>
+          <w:p>
+            <w:r>
+              <w:rPr>
+                <w:b/>
+                <w:sz w:val="19"/>
+              </w:rPr>
               <w:t>Drives</w:t>
             </w:r>
           </w:p>
@@ -1558,7 +1618,7 @@
                 <w:b w:val="0"/>
                 <w:sz w:val="19"/>
               </w:rPr>
-              <w:t>CAC denominator = MTD ad spend / new visits</w:t>
+              <w:t>CAC = MTD ad spend / new visits = $111,231 / 1,134 = $98.09</w:t>
             </w:r>
           </w:p>
         </w:tc>
@@ -1685,7 +1745,7 @@
                 <w:b/>
                 <w:sz w:val="19"/>
               </w:rPr>
-              <w:t>Identifier</w:t>
+              <w:t xml:space="preserve">Existing = </w:t>
             </w:r>
           </w:p>
         </w:tc>
@@ -1699,7 +1759,7 @@
                 <w:b w:val="0"/>
                 <w:sz w:val="19"/>
               </w:rPr>
-              <w:t>distinct guest_name</w:t>
+              <w:t>sale this month + first-ever sale before this month, non-membership first</w:t>
             </w:r>
           </w:p>
         </w:tc>
@@ -1715,7 +1775,7 @@
                 <w:b/>
                 <w:sz w:val="19"/>
               </w:rPr>
-              <w:t xml:space="preserve">Existing = </w:t>
+              <w:t>Value (Jun 2026)</w:t>
             </w:r>
           </w:p>
         </w:tc>
@@ -1729,7 +1789,7 @@
                 <w:b w:val="0"/>
                 <w:sz w:val="19"/>
               </w:rPr>
-              <w:t>sale this month + first-ever sale before this month, non-membership first</w:t>
+              <w:t>3,385</w:t>
             </w:r>
           </w:p>
         </w:tc>
@@ -1996,6 +2056,36 @@
                 <w:sz w:val="19"/>
               </w:rPr>
               <w:t>12 stores (excl. Bridgewater/Lancaster &lt;12mo + 5 closed)</w:t>
+            </w:r>
+          </w:p>
+        </w:tc>
+      </w:tr>
+      <w:tr>
+        <w:tc>
+          <w:tcPr>
+            <w:tcW w:type="dxa" w:w="4320"/>
+          </w:tcPr>
+          <w:p>
+            <w:r>
+              <w:rPr>
+                <w:b/>
+                <w:sz w:val="19"/>
+              </w:rPr>
+              <w:t>Computed value (Jun 2026)</w:t>
+            </w:r>
+          </w:p>
+        </w:tc>
+        <w:tc>
+          <w:tcPr>
+            <w:tcW w:type="dxa" w:w="4320"/>
+          </w:tcPr>
+          <w:p>
+            <w:r>
+              <w:rPr>
+                <w:b w:val="0"/>
+                <w:sz w:val="19"/>
+              </w:rPr>
+              <w:t>+41.1%</w:t>
             </w:r>
           </w:p>
         </w:tc>

</xml_diff>

<commit_message>
edit existing to match tooltip
</commit_message>
<xml_diff>
--- a/Evolve_Dashboard_Metric_Computations.docx
+++ b/Evolve_Dashboard_Metric_Computations.docx
@@ -1467,39 +1467,11 @@
         <w:ind w:left="280"/>
       </w:pPr>
       <w:r>
-        <w:rPr>
-          <w:rFonts w:ascii="Consolas" w:hAnsi="Consolas"/>
-          <w:color w:val="1F3955"/>
-          <w:sz w:val="19"/>
-        </w:rPr>
-        <w:t>COUNT(DISTINCT guest_name) from BRONZE_ZENOTI_SALES_ACCRUAL WHERE:</w:t>
+        <w:t>SUM(new_guest_count) from BRONZE_ZENOTI_BUSINESS_KPI WHERE business_kpi_date in the reporting month</w:t>
+        <w:br/>
       </w:r>
       <w:r>
-        <w:rPr>
-          <w:rFonts w:ascii="Consolas" w:hAnsi="Consolas"/>
-          <w:color w:val="1F3955"/>
-          <w:sz w:val="19"/>
-        </w:rPr>
-        <w:br/>
-        <w:t xml:space="preserve">   the guest's FIRST-EVER sale date (MIN sale_date) falls in the reporting month</w:t>
-      </w:r>
-      <w:r>
-        <w:rPr>
-          <w:rFonts w:ascii="Consolas" w:hAnsi="Consolas"/>
-          <w:color w:val="1F3955"/>
-          <w:sz w:val="19"/>
-        </w:rPr>
-        <w:br/>
-        <w:t xml:space="preserve">   AND that first purchase is non-membership (item_category &lt;&gt; 'Memberships')</w:t>
-      </w:r>
-      <w:r>
-        <w:rPr>
-          <w:rFonts w:ascii="Consolas" w:hAnsi="Consolas"/>
-          <w:color w:val="1F3955"/>
-          <w:sz w:val="19"/>
-        </w:rPr>
-        <w:br/>
-        <w:t>(candidates pre-filtered to guests who sold this month; membership-only first sale excluded)</w:t>
+        <w:t>(Zenoti's official daily "Business KPI" export — one row per day/center; SUM honors the location filter)</w:t>
       </w:r>
     </w:p>
     <w:tbl>
@@ -1519,10 +1491,6 @@
           </w:tcPr>
           <w:p>
             <w:r>
-              <w:rPr>
-                <w:b/>
-                <w:sz w:val="19"/>
-              </w:rPr>
               <w:t>Source</w:t>
             </w:r>
           </w:p>
@@ -1533,11 +1501,7 @@
           </w:tcPr>
           <w:p>
             <w:r>
-              <w:rPr>
-                <w:b w:val="0"/>
-                <w:sz w:val="19"/>
-              </w:rPr>
-              <w:t>BRONZE_ZENOTI_SALES_ACCRUAL</w:t>
+              <w:t>dbo.BRONZE_ZENOTI_BUSINESS_KPI (LIVE) — Zenoti daily Business KPI export</w:t>
             </w:r>
           </w:p>
         </w:tc>
@@ -1549,11 +1513,7 @@
           </w:tcPr>
           <w:p>
             <w:r>
-              <w:rPr>
-                <w:b/>
-                <w:sz w:val="19"/>
-              </w:rPr>
-              <w:t xml:space="preserve">New = </w:t>
+              <w:t>New =</w:t>
             </w:r>
           </w:p>
         </w:tc>
@@ -1563,11 +1523,7 @@
           </w:tcPr>
           <w:p>
             <w:r>
-              <w:rPr>
-                <w:b w:val="0"/>
-                <w:sz w:val="19"/>
-              </w:rPr>
-              <w:t>first-ever sale date in month, first purchase non-membership</w:t>
+              <w:t>SUM of the official daily "New Guest Count" over the month</w:t>
             </w:r>
           </w:p>
         </w:tc>
@@ -1579,11 +1535,7 @@
           </w:tcPr>
           <w:p>
             <w:r>
-              <w:rPr>
-                <w:b/>
-                <w:sz w:val="19"/>
-              </w:rPr>
-              <w:t>'membershipversionid=Not Applicable'</w:t>
+              <w:t>Grain</w:t>
             </w:r>
           </w:p>
         </w:tc>
@@ -1593,11 +1545,7 @@
           </w:tcPr>
           <w:p>
             <w:r>
-              <w:rPr>
-                <w:b w:val="0"/>
-                <w:sz w:val="19"/>
-              </w:rPr>
-              <w:t>no such column on sales table -&gt; item_category &lt;&gt; 'Memberships'</w:t>
+              <w:t>one row per day per center; honors selected centers (center_name)</w:t>
             </w:r>
           </w:p>
         </w:tc>
@@ -1609,11 +1557,7 @@
           </w:tcPr>
           <w:p>
             <w:r>
-              <w:rPr>
-                <w:b/>
-                <w:sz w:val="19"/>
-              </w:rPr>
-              <w:t>Value (Jun 2026)</w:t>
+              <w:t>Value (Jul 2026 MTD, thru Jul 9)</w:t>
             </w:r>
           </w:p>
         </w:tc>
@@ -1623,11 +1567,7 @@
           </w:tcPr>
           <w:p>
             <w:r>
-              <w:rPr>
-                <w:b w:val="0"/>
-                <w:sz w:val="19"/>
-              </w:rPr>
-              <w:t>1,134</w:t>
+              <w:t>run VERIFY_METRICS.sql for the live figure (was frozen at 32 under the old CSV)</w:t>
             </w:r>
           </w:p>
         </w:tc>
@@ -1639,11 +1579,7 @@
           </w:tcPr>
           <w:p>
             <w:r>
-              <w:rPr>
-                <w:b/>
-                <w:sz w:val="19"/>
-              </w:rPr>
-              <w:t>Drives</w:t>
+              <w:t>Fallback</w:t>
             </w:r>
           </w:p>
         </w:tc>
@@ -1653,11 +1589,7 @@
           </w:tcPr>
           <w:p>
             <w:r>
-              <w:rPr>
-                <w:b w:val="0"/>
-                <w:sz w:val="19"/>
-              </w:rPr>
-              <w:t>CAC = MTD ad spend / new visits = $111,231 / 1,134 = $98.09</w:t>
+              <w:t>computed sales-accrual/cash count when the warehouse has no rows for the range</w:t>
             </w:r>
           </w:p>
         </w:tc>
@@ -1673,12 +1605,7 @@
         <w:spacing w:after="200"/>
       </w:pPr>
       <w:r>
-        <w:rPr>
-          <w:b/>
-          <w:color w:val="1E7A3C"/>
-          <w:sz w:val="19"/>
-        </w:rPr>
-        <w:t>MATCHES — Defined on sales accrual: first-ever sale date per guest_name in the month, non-membership first purchase. (Earlier iterations used Bi_FactCollections_s3 — too slow/timed out — then cash first_visit; now sales accrual per the spec.) Computed in one scan with Existing + ASP; cached + single-flight; header waits at most ~6s and otherwise keeps the cash fallback while the cache fills. Helper: utils/new_customers.py.</w:t>
+        <w:t>MATCHES — CHANGED (this session): now reads the LIVE dbo.BRONZE_ZENOTI_BUSINESS_KPI table (Zenoti's authoritative New Guest Count), replacing the stale data/new_guests_daily.json CSV that was rebuilt only by hand — July had frozen at Jul 1-2 (=32) because the Jul 3-9 CSVs were never re-imported. Same migration Rebook Rate made (utils/rebooking_kpi.py): no rebuild step, no lru_cache restart. Helper: utils/new_guests.py (new_guest_count). Falls back to the sales-accrual/cash count only for ranges the warehouse does not cover.</w:t>
       </w:r>
     </w:p>
     <w:p>
@@ -1698,39 +1625,15 @@
         <w:ind w:left="280"/>
       </w:pPr>
       <w:r>
-        <w:rPr>
-          <w:rFonts w:ascii="Consolas" w:hAnsi="Consolas"/>
-          <w:color w:val="1F3955"/>
-          <w:sz w:val="19"/>
-        </w:rPr>
-        <w:t>COUNT(DISTINCT guest_name) from BRONZE_ZENOTI_SALES_ACCRUAL WHERE:</w:t>
+        <w:t>Existing Customer Visits = Total distinct paying customers this month (cash) − New Customer Visits</w:t>
+        <w:br/>
       </w:r>
       <w:r>
-        <w:rPr>
-          <w:rFonts w:ascii="Consolas" w:hAnsi="Consolas"/>
-          <w:color w:val="1F3955"/>
-          <w:sz w:val="19"/>
-        </w:rPr>
+        <w:t xml:space="preserve">   Total = COUNT(DISTINCT guest_name WHERE sales_collected_exc_tax &gt; 0) from BRONZE_ZENOTI_CASH_COLLECTIONS</w:t>
         <w:br/>
-        <w:t xml:space="preserve">   the guest has a sale within the reporting month (&gt;0 invoice in MTD)</w:t>
       </w:r>
       <w:r>
-        <w:rPr>
-          <w:rFonts w:ascii="Consolas" w:hAnsi="Consolas"/>
-          <w:color w:val="1F3955"/>
-          <w:sz w:val="19"/>
-        </w:rPr>
-        <w:br/>
-        <w:t xml:space="preserve">   AND first-ever sale date is BEFORE this month (a past purchase not in this month -&gt; returning)</w:t>
-      </w:r>
-      <w:r>
-        <w:rPr>
-          <w:rFonts w:ascii="Consolas" w:hAnsi="Consolas"/>
-          <w:color w:val="1F3955"/>
-          <w:sz w:val="19"/>
-        </w:rPr>
-        <w:br/>
-        <w:t xml:space="preserve">   AND first purchase is non-membership (item_category &lt;&gt; 'Memberships')</w:t>
+        <w:t xml:space="preserve">   Existing = max(Total − New Customer Visits, 0)   -- returning customers only</w:t>
       </w:r>
     </w:p>
     <w:tbl>
@@ -1750,11 +1653,7 @@
           </w:tcPr>
           <w:p>
             <w:r>
-              <w:rPr>
-                <w:b/>
-                <w:sz w:val="19"/>
-              </w:rPr>
-              <w:t>Source</w:t>
+              <w:t>Definition</w:t>
             </w:r>
           </w:p>
         </w:tc>
@@ -1764,11 +1663,7 @@
           </w:tcPr>
           <w:p>
             <w:r>
-              <w:rPr>
-                <w:b w:val="0"/>
-                <w:sz w:val="19"/>
-              </w:rPr>
-              <w:t>BRONZE_ZENOTI_SALES_ACCRUAL (same scan as New)</w:t>
+              <w:t>returning customers only = Total distinct customers − New Customer Visits</w:t>
             </w:r>
           </w:p>
         </w:tc>
@@ -1780,11 +1675,7 @@
           </w:tcPr>
           <w:p>
             <w:r>
-              <w:rPr>
-                <w:b/>
-                <w:sz w:val="19"/>
-              </w:rPr>
-              <w:t xml:space="preserve">Existing = </w:t>
+              <w:t>Total source</w:t>
             </w:r>
           </w:p>
         </w:tc>
@@ -1794,11 +1685,7 @@
           </w:tcPr>
           <w:p>
             <w:r>
-              <w:rPr>
-                <w:b w:val="0"/>
-                <w:sz w:val="19"/>
-              </w:rPr>
-              <w:t>sale this month + first-ever sale before this month, non-membership first</w:t>
+              <w:t>BRONZE_ZENOTI_CASH_COLLECTIONS — DISTINCT guest_name, cash payment filter, invoice &gt; 0</w:t>
             </w:r>
           </w:p>
         </w:tc>
@@ -1810,11 +1697,7 @@
           </w:tcPr>
           <w:p>
             <w:r>
-              <w:rPr>
-                <w:b/>
-                <w:sz w:val="19"/>
-              </w:rPr>
-              <w:t>Value (Jun 2026)</w:t>
+              <w:t>New subtracted</w:t>
             </w:r>
           </w:p>
         </w:tc>
@@ -1824,11 +1707,7 @@
           </w:tcPr>
           <w:p>
             <w:r>
-              <w:rPr>
-                <w:b w:val="0"/>
-                <w:sz w:val="19"/>
-              </w:rPr>
-              <w:t>3,385</w:t>
+              <w:t>the shipped New Customer Visits value (BRONZE_ZENOTI_BUSINESS_KPI)</w:t>
             </w:r>
           </w:p>
         </w:tc>
@@ -1840,11 +1719,7 @@
           </w:tcPr>
           <w:p>
             <w:r>
-              <w:rPr>
-                <w:b/>
-                <w:sz w:val="19"/>
-              </w:rPr>
-              <w:t>Note</w:t>
+              <w:t>Guard</w:t>
             </w:r>
           </w:p>
         </w:tc>
@@ -1854,11 +1729,51 @@
           </w:tcPr>
           <w:p>
             <w:r>
-              <w:rPr>
-                <w:b w:val="0"/>
-                <w:sz w:val="19"/>
-              </w:rPr>
-              <w:t>new + existing = this-month guests with a non-membership first purchase</w:t>
+              <w:t>max(Total − New, 0) — never negative</w:t>
+            </w:r>
+          </w:p>
+        </w:tc>
+      </w:tr>
+      <w:tr>
+        <w:tc>
+          <w:tcPr>
+            <w:tcW w:type="dxa" w:w="4320"/>
+          </w:tcPr>
+          <w:p>
+            <w:r>
+              <w:t>Example (illustrative)</w:t>
+            </w:r>
+          </w:p>
+        </w:tc>
+        <w:tc>
+          <w:tcPr>
+            <w:tcW w:type="dxa" w:w="4320"/>
+          </w:tcPr>
+          <w:p>
+            <w:r>
+              <w:t>Total 4,600 − New 1,150 = 3,450 returning (run VERIFY_METRICS.sql for live)</w:t>
+            </w:r>
+          </w:p>
+        </w:tc>
+      </w:tr>
+      <w:tr>
+        <w:tc>
+          <w:tcPr>
+            <w:tcW w:type="dxa" w:w="4320"/>
+          </w:tcPr>
+          <w:p>
+            <w:r>
+              <w:t>Invariant</w:t>
+            </w:r>
+          </w:p>
+        </w:tc>
+        <w:tc>
+          <w:tcPr>
+            <w:tcW w:type="dxa" w:w="4320"/>
+          </w:tcPr>
+          <w:p>
+            <w:r>
+              <w:t>New + Existing = Total distinct customers (clean, non-overlapping partition)</w:t>
             </w:r>
           </w:p>
         </w:tc>
@@ -1874,12 +1789,170 @@
         <w:spacing w:after="200"/>
       </w:pPr>
       <w:r>
-        <w:rPr>
-          <w:b/>
-          <w:color w:val="1E7A3C"/>
-          <w:sz w:val="19"/>
-        </w:rPr>
-        <w:t>MATCHES — Inverse of New Customer Visits (first sale before the month vs in the month), computed in the same sales-accrual scan. Header card uses h.existing_client_count; the location-table TOTAL row was aligned to this header value.</w:t>
+        <w:t>MATCHES — CHANGED (this session): now RETURNING customers only = Total distinct paying customers (cash) − New Customer Visits, so New + Existing = Total with no double-count. Previously it was overridden to total_customer_count (ALL distinct customers), which counted new customers as existing and made New + Existing exceed Total. KPI title unchanged ("Existing Customer Visits"). ASP (Existing) is unaffected — it still uses asp_existing_clients from the main query, not this count. routers/mtd.py.</w:t>
+      </w:r>
+    </w:p>
+    <w:p>
+      <w:pPr>
+        <w:pStyle w:val="Heading2"/>
+      </w:pPr>
+      <w:r>
+        <w:t>Existing Members</w:t>
+      </w:r>
+    </w:p>
+    <w:p>
+      <w:r>
+        <w:t>COUNT(DISTINCT guest_code) from BRONZE_ZENOTI_MEMBERSHIPS_SALES WHERE sale_date in the reporting month</w:t>
+        <w:br/>
+        <w:t>(every member with membership activity this month — new sign-ups AND recurring auto-bills — counted once)</w:t>
+      </w:r>
+    </w:p>
+    <w:tbl>
+      <w:tblPr>
+        <w:tblStyle w:val="TableGrid"/>
+        <w:tblW w:type="auto" w:w="0"/>
+        <w:tblLook w:firstColumn="1" w:firstRow="1" w:lastColumn="0" w:lastRow="0" w:noHBand="0" w:noVBand="1" w:val="04A0"/>
+      </w:tblPr>
+      <w:tblGrid>
+        <w:gridCol w:w="4320"/>
+        <w:gridCol w:w="4320"/>
+      </w:tblGrid>
+      <w:tr>
+        <w:tc>
+          <w:tcPr>
+            <w:tcW w:type="dxa" w:w="4320"/>
+          </w:tcPr>
+          <w:p>
+            <w:r>
+              <w:t>Source</w:t>
+            </w:r>
+          </w:p>
+        </w:tc>
+        <w:tc>
+          <w:tcPr>
+            <w:tcW w:type="dxa" w:w="4320"/>
+          </w:tcPr>
+          <w:p>
+            <w:r>
+              <w:t>dbo.BRONZE_ZENOTI_MEMBERSHIPS_SALES (LIVE)</w:t>
+            </w:r>
+          </w:p>
+        </w:tc>
+      </w:tr>
+      <w:tr>
+        <w:tc>
+          <w:tcPr>
+            <w:tcW w:type="dxa" w:w="4320"/>
+          </w:tcPr>
+          <w:p>
+            <w:r>
+              <w:t>Existing Members =</w:t>
+            </w:r>
+          </w:p>
+        </w:tc>
+        <w:tc>
+          <w:tcPr>
+            <w:tcW w:type="dxa" w:w="4320"/>
+          </w:tcPr>
+          <w:p>
+            <w:r>
+              <w:t>DISTINCT guest_code with any membership sale/bill this month</w:t>
+            </w:r>
+          </w:p>
+        </w:tc>
+      </w:tr>
+      <w:tr>
+        <w:tc>
+          <w:tcPr>
+            <w:tcW w:type="dxa" w:w="4320"/>
+          </w:tcPr>
+          <w:p>
+            <w:r>
+              <w:t>Includes</w:t>
+            </w:r>
+          </w:p>
+        </w:tc>
+        <w:tc>
+          <w:tcPr>
+            <w:tcW w:type="dxa" w:w="4320"/>
+          </w:tcPr>
+          <w:p>
+            <w:r>
+              <w:t>new sign-ups + recurring auto-bills (no sale_type filter) — total distinct member base</w:t>
+            </w:r>
+          </w:p>
+        </w:tc>
+      </w:tr>
+      <w:tr>
+        <w:tc>
+          <w:tcPr>
+            <w:tcW w:type="dxa" w:w="4320"/>
+          </w:tcPr>
+          <w:p>
+            <w:r>
+              <w:t>New Members (contrast)</w:t>
+            </w:r>
+          </w:p>
+        </w:tc>
+        <w:tc>
+          <w:tcPr>
+            <w:tcW w:type="dxa" w:w="4320"/>
+          </w:tcPr>
+          <w:p>
+            <w:r>
+              <w:t>sale_type='Sale' + start_date in month (utils/memberships.py new_memberships)</w:t>
+            </w:r>
+          </w:p>
+        </w:tc>
+      </w:tr>
+      <w:tr>
+        <w:tc>
+          <w:tcPr>
+            <w:tcW w:type="dxa" w:w="4320"/>
+          </w:tcPr>
+          <w:p>
+            <w:r>
+              <w:t>Value (Jul 2026 MTD)</w:t>
+            </w:r>
+          </w:p>
+        </w:tc>
+        <w:tc>
+          <w:tcPr>
+            <w:tcW w:type="dxa" w:w="4320"/>
+          </w:tcPr>
+          <w:p>
+            <w:r>
+              <w:t>run VERIFY_METRICS.sql (live); invariant: new_members ≤ existing_members</w:t>
+            </w:r>
+          </w:p>
+        </w:tc>
+      </w:tr>
+      <w:tr>
+        <w:tc>
+          <w:tcPr>
+            <w:tcW w:type="dxa" w:w="4320"/>
+          </w:tcPr>
+          <w:p>
+            <w:r>
+              <w:t>Parallels</w:t>
+            </w:r>
+          </w:p>
+        </w:tc>
+        <w:tc>
+          <w:tcPr>
+            <w:tcW w:type="dxa" w:w="4320"/>
+          </w:tcPr>
+          <w:p>
+            <w:r>
+              <w:t>Existing Customer Visits shape (total distinct transacting), on the membership table</w:t>
+            </w:r>
+          </w:p>
+        </w:tc>
+      </w:tr>
+    </w:tbl>
+    <w:p>
+      <w:r>
+        <w:t>NEW (this session) — total distinct members transacting this month, the membership analogue of Existing Customer Visits' "total distinct" shape. Helper: utils/memberships.py (existing_members); exposed as result['existing_members'] in /api/mtd-kpi-header. Not yet a dashboard tile (Memberships view is still Coming Soon). New Members is a subset (sale_type='Sale').</w:t>
       </w:r>
     </w:p>
     <w:p>
@@ -6071,11 +6144,7 @@
           </w:tcPr>
           <w:p>
             <w:r>
-              <w:rPr>
-                <w:b/>
-                <w:sz w:val="19"/>
-              </w:rPr>
-              <w:t>Google (Jun 2026 MTD)</w:t>
+              <w:t>Google (Sheet1, Jul 2026 MTD)</w:t>
             </w:r>
           </w:p>
         </w:tc>
@@ -6085,11 +6154,7 @@
           </w:tcPr>
           <w:p>
             <w:r>
-              <w:rPr>
-                <w:b w:val="0"/>
-                <w:sz w:val="19"/>
-              </w:rPr>
-              <w:t>$33,450.51</w:t>
+              <w:t>$11,991.03</w:t>
             </w:r>
           </w:p>
         </w:tc>
@@ -6101,11 +6166,7 @@
           </w:tcPr>
           <w:p>
             <w:r>
-              <w:rPr>
-                <w:b/>
-                <w:sz w:val="19"/>
-              </w:rPr>
-              <w:t>Facebook (Jun 2026 MTD)</w:t>
+              <w:t>Facebook (Fb, Jul 2026 MTD)</w:t>
             </w:r>
           </w:p>
         </w:tc>
@@ -6115,11 +6176,7 @@
           </w:tcPr>
           <w:p>
             <w:r>
-              <w:rPr>
-                <w:b w:val="0"/>
-                <w:sz w:val="19"/>
-              </w:rPr>
-              <w:t>$77,780.82</w:t>
+              <w:t>$24,833.50</w:t>
             </w:r>
           </w:p>
         </w:tc>
@@ -6131,10 +6188,6 @@
           </w:tcPr>
           <w:p>
             <w:r>
-              <w:rPr>
-                <w:b/>
-                <w:sz w:val="19"/>
-              </w:rPr>
               <w:t>Computed value</w:t>
             </w:r>
           </w:p>
@@ -6145,11 +6198,7 @@
           </w:tcPr>
           <w:p>
             <w:r>
-              <w:rPr>
-                <w:b w:val="0"/>
-                <w:sz w:val="19"/>
-              </w:rPr>
-              <w:t>$111,231.35 (~$111K)</w:t>
+              <w:t>$36,824.53  (Jul 1-9, 2026)</w:t>
             </w:r>
           </w:p>
         </w:tc>
@@ -6161,11 +6210,7 @@
           </w:tcPr>
           <w:p>
             <w:r>
-              <w:rPr>
-                <w:b/>
-                <w:sz w:val="19"/>
-              </w:rPr>
-              <w:t>Dashboard (after deploy)</w:t>
+              <w:t>Coverage</w:t>
             </w:r>
           </w:p>
         </w:tc>
@@ -6175,11 +6220,29 @@
           </w:tcPr>
           <w:p>
             <w:r>
-              <w:rPr>
-                <w:b w:val="0"/>
-                <w:sz w:val="19"/>
-              </w:rPr>
-              <w:t>~$111K</w:t>
+              <w:t>through 2026-07-09 (refreshed workbook)</w:t>
+            </w:r>
+          </w:p>
+        </w:tc>
+      </w:tr>
+      <w:tr>
+        <w:tc>
+          <w:tcPr>
+            <w:tcW w:type="dxa" w:w="4320"/>
+          </w:tcPr>
+          <w:p>
+            <w:r>
+              <w:t>Dashboard (after restart)</w:t>
+            </w:r>
+          </w:p>
+        </w:tc>
+        <w:tc>
+          <w:tcPr>
+            <w:tcW w:type="dxa" w:w="4320"/>
+          </w:tcPr>
+          <w:p>
+            <w:r>
+              <w:t>~$36.8K</w:t>
             </w:r>
           </w:p>
         </w:tc>
@@ -6195,12 +6258,7 @@
         <w:spacing w:after="200"/>
       </w:pPr>
       <w:r>
-        <w:rPr>
-          <w:b/>
-          <w:color w:val="1E7A3C"/>
-          <w:sz w:val="19"/>
-        </w:rPr>
-        <w:t>MATCHES — NOT FROM THE DATABASE. Source is a bundled static file: data/Google Ads.xlsx -&gt; data/ad_spend_daily.json (regenerate via scripts/build_ad_spend_json.py when refreshed). Sums the 'google' AND 'Fb' tabs only (Sheet1 is excluded to avoid double-counting). MTD figure is summed dynamically for the window; spend data is static. Chain-level only (campaigns aren't location-tagged).</w:t>
+        <w:t>MATCHES — NOT FROM THE DATABASE. Source is the bundled workbook data/Google Ads.xlsx -&gt; data/ad_spend_daily.json (rebuild via scripts/build_ad_spend_json.py after refreshing). Sums BOTH tabs: Sheet1 = Google, Fb = Facebook (the workbook has no separate 'google' tab). REFRESHED this session from the latest export — coverage moved Jul 3 -&gt; Jul 9, so July MTD went $11,737 -&gt; $36,824.53. Chain-level only (campaigns are not location-tagged). Note: _daily() is lru_cached, so a running API process needs a restart to pick up the rebuilt JSON. No live DB table exists for ad spend, so this stays a manual refresh.</w:t>
       </w:r>
     </w:p>
     <w:p>
@@ -6245,10 +6303,6 @@
           </w:tcPr>
           <w:p>
             <w:r>
-              <w:rPr>
-                <w:b/>
-                <w:sz w:val="19"/>
-              </w:rPr>
               <w:t>Numerator (MTD ad spend, Google+FB)</w:t>
             </w:r>
           </w:p>
@@ -6259,11 +6313,7 @@
           </w:tcPr>
           <w:p>
             <w:r>
-              <w:rPr>
-                <w:b w:val="0"/>
-                <w:sz w:val="19"/>
-              </w:rPr>
-              <w:t>111,231.35</w:t>
+              <w:t>36,824.53  (Jul 1-9, 2026)</w:t>
             </w:r>
           </w:p>
         </w:tc>
@@ -6275,11 +6325,7 @@
           </w:tcPr>
           <w:p>
             <w:r>
-              <w:rPr>
-                <w:b/>
-                <w:sz w:val="19"/>
-              </w:rPr>
-              <w:t>Denominator (new customers)</w:t>
+              <w:t>Denominator (New Customer Visits)</w:t>
             </w:r>
           </w:p>
         </w:tc>
@@ -6289,11 +6335,7 @@
           </w:tcPr>
           <w:p>
             <w:r>
-              <w:rPr>
-                <w:b w:val="0"/>
-                <w:sz w:val="19"/>
-              </w:rPr>
-              <w:t>605</w:t>
+              <w:t>live BRONZE_ZENOTI_BUSINESS_KPI new_guest_count (run VERIFY)</w:t>
             </w:r>
           </w:p>
         </w:tc>
@@ -6305,10 +6347,6 @@
           </w:tcPr>
           <w:p>
             <w:r>
-              <w:rPr>
-                <w:b/>
-                <w:sz w:val="19"/>
-              </w:rPr>
               <w:t>Computed value</w:t>
             </w:r>
           </w:p>
@@ -6319,11 +6357,7 @@
           </w:tcPr>
           <w:p>
             <w:r>
-              <w:rPr>
-                <w:b w:val="0"/>
-                <w:sz w:val="19"/>
-              </w:rPr>
-              <w:t>$183.85</w:t>
+              <w:t>ad spend ÷ new visits  (example: 36,824.53 ÷ 1,150 = $32.02)</w:t>
             </w:r>
           </w:p>
         </w:tc>
@@ -6335,11 +6369,7 @@
           </w:tcPr>
           <w:p>
             <w:r>
-              <w:rPr>
-                <w:b/>
-                <w:sz w:val="19"/>
-              </w:rPr>
-              <w:t>Dashboard (after deploy)</w:t>
+              <w:t>Dashboard (after restart)</w:t>
             </w:r>
           </w:p>
         </w:tc>
@@ -6349,11 +6379,7 @@
           </w:tcPr>
           <w:p>
             <w:r>
-              <w:rPr>
-                <w:b w:val="0"/>
-                <w:sz w:val="19"/>
-              </w:rPr>
-              <w:t>~$184</w:t>
+              <w:t>MTD ad spend ÷ New Customer Visits</w:t>
             </w:r>
           </w:p>
         </w:tc>
@@ -6369,12 +6395,7 @@
         <w:spacing w:after="200"/>
       </w:pPr>
       <w:r>
-        <w:rPr>
-          <w:b/>
-          <w:color w:val="1E7A3C"/>
-          <w:sz w:val="19"/>
-        </w:rPr>
-        <w:t>MATCHES — Numerator from the bundled ad-spend file (Google + Facebook); denominator (new customers) from the DB. Correct on the All-Locations view; if a single location is selected, ad spend stays chain-wide while new customers is location-scoped, so CAC is mismatched there.</w:t>
+        <w:t>MATCHES — CAC = MTD Ad Spend / New Customer Visits (routers/mtd.py). Numerator from the refreshed bundled workbook (Google + Facebook, thru Jul 9); denominator is now the LIVE Business KPI new_guest_count (this session migration), so both sides are current. All-Locations is correct; for a single location, ad spend stays chain-wide while New is location-scoped, so CAC is mismatched there.</w:t>
       </w:r>
     </w:p>
     <w:p>
@@ -6993,6 +7014,38 @@
           <w:sz w:val="20"/>
         </w:rPr>
         <w:t>KPI header performance — the /api/mtd-kpi-header handler ran ~10 queries sequentially (~27s), tripping the gateway timeout (502s) and leaving the Overview hanging. Fixes: (1) enrichment helpers now run in parallel (ThreadPoolExecutor); (2) the connection pool was serializing that parallelism — get_sql_connection ran its SELECT-1 health check while holding the global lock, so one dead pooled connection blocked every checkout for the full timeout, and run_query returned timed-out (dead) connections to the pool; both fixed (validate lock-free, close dead connections); (3) the two slow Bi_* metrics were moved onto the main cash query (see above). Header is now ~3-5s and the concurrent Overview load (header + operations-summary) no longer 500s.</w:t>
+      </w:r>
+    </w:p>
+    <w:p>
+      <w:pPr>
+        <w:pStyle w:val="ListBullet"/>
+      </w:pPr>
+      <w:r>
+        <w:t>New Customer Visits — MIGRATED to the LIVE dbo.BRONZE_ZENOTI_BUSINESS_KPI table (SUM new_guest_count), replacing the stale data/new_guests_daily.json CSV that froze July at Jul 1-2 (=32). No rebuild/restart needed. utils/new_guests.py.</w:t>
+      </w:r>
+    </w:p>
+    <w:p>
+      <w:pPr>
+        <w:pStyle w:val="ListBullet"/>
+      </w:pPr>
+      <w:r>
+        <w:t>Existing Customer Visits — now RETURNING only = Total distinct customers (cash) − New Customer Visits, so New + Existing = Total (was overridden to total distinct, double-counting new customers). KPI title unchanged. routers/mtd.py.</w:t>
+      </w:r>
+    </w:p>
+    <w:p>
+      <w:pPr>
+        <w:pStyle w:val="ListBullet"/>
+      </w:pPr>
+      <w:r>
+        <w:t>Existing Members — NEW metric: DISTINCT guest_code with a membership sale this month (new + recurring) from BRONZE_ZENOTI_MEMBERSHIPS_SALES. utils/memberships.py (existing_members); in the API header, not yet a tile.</w:t>
+      </w:r>
+    </w:p>
+    <w:p>
+      <w:pPr>
+        <w:pStyle w:val="ListBullet"/>
+      </w:pPr>
+      <w:r>
+        <w:t>MTD Ad Spend / CAC — refreshed data/Google Ads.xlsx (Sheet1=Google + Fb=Facebook) through Jul 9: July MTD $11,737 -&gt; $36,824.53. lru_cache =&gt; restart to apply. No live DB source exists for ad spend.</w:t>
       </w:r>
     </w:p>
     <w:sectPr>

</xml_diff>